<commit_message>
Add new project files
</commit_message>
<xml_diff>
--- a/SPAREDASH-LOOGBOOK FINAL.docx
+++ b/SPAREDASH-LOOGBOOK FINAL.docx
@@ -235,11 +235,9 @@
             <w:r>
               <w:t xml:space="preserve">SCHOOL OF COMPUTING </w:t>
             </w:r>
-            <w:proofErr w:type="gramStart"/>
-            <w:r>
-              <w:t>AND  INFORMATICS</w:t>
-            </w:r>
-            <w:proofErr w:type="gramEnd"/>
+            <w:r>
+              <w:t>AND INFORMATICS</w:t>
+            </w:r>
           </w:p>
         </w:tc>
       </w:tr>
@@ -288,11 +286,9 @@
             <w:r>
               <w:t xml:space="preserve">BACHELOR OF SSCIENCE IN </w:t>
             </w:r>
-            <w:proofErr w:type="gramStart"/>
-            <w:r>
-              <w:t>IFORMATION  TECHNOLOGY</w:t>
-            </w:r>
-            <w:proofErr w:type="gramEnd"/>
+            <w:r>
+              <w:t>IFORMATION TECHNOLOGY</w:t>
+            </w:r>
             <w:r>
               <w:t xml:space="preserve"> (BS IT)</w:t>
             </w:r>
@@ -1375,7 +1371,7 @@
         <w:tblLook w:val="04A0" w:firstRow="1" w:lastRow="0" w:firstColumn="1" w:lastColumn="0" w:noHBand="0" w:noVBand="1"/>
       </w:tblPr>
       <w:tblGrid>
-        <w:gridCol w:w="9360"/>
+        <w:gridCol w:w="9760"/>
       </w:tblGrid>
       <w:tr>
         <w:tc>
@@ -1412,924 +1408,15 @@
             <w:pPr>
               <w:jc w:val="center"/>
             </w:pPr>
-          </w:p>
-        </w:tc>
-      </w:tr>
-    </w:tbl>
-    <w:p>
-      <w:pPr>
-        <w:spacing w:before="80" w:after="80"/>
-      </w:pPr>
-      <w:r>
-        <w:t xml:space="preserve"> </w:t>
-      </w:r>
-    </w:p>
-    <w:p>
-      <w:pPr>
-        <w:spacing w:before="200" w:after="100"/>
-      </w:pPr>
-      <w:r>
-        <w:rPr>
-          <w:b/>
-          <w:bCs/>
-          <w:sz w:val="24"/>
-          <w:szCs w:val="24"/>
-        </w:rPr>
-        <w:t>Tools / Software Used</w:t>
-      </w:r>
-    </w:p>
-    <w:p>
-      <w:pPr>
-        <w:spacing w:before="80" w:after="80"/>
-      </w:pPr>
-      <w:r>
-        <w:t xml:space="preserve"> </w:t>
-      </w:r>
-    </w:p>
-    <w:tbl>
-      <w:tblPr>
-        <w:tblW w:w="9360" w:type="dxa"/>
-        <w:tblBorders>
-          <w:top w:val="single" w:sz="4" w:space="0" w:color="auto"/>
-          <w:left w:val="single" w:sz="4" w:space="0" w:color="auto"/>
-          <w:bottom w:val="single" w:sz="4" w:space="0" w:color="auto"/>
-          <w:right w:val="single" w:sz="4" w:space="0" w:color="auto"/>
-          <w:insideH w:val="single" w:sz="4" w:space="0" w:color="auto"/>
-          <w:insideV w:val="single" w:sz="4" w:space="0" w:color="auto"/>
-        </w:tblBorders>
-        <w:tblCellMar>
-          <w:left w:w="10" w:type="dxa"/>
-          <w:right w:w="10" w:type="dxa"/>
-        </w:tblCellMar>
-        <w:tblLook w:val="04A0" w:firstRow="1" w:lastRow="0" w:firstColumn="1" w:lastColumn="0" w:noHBand="0" w:noVBand="1"/>
-      </w:tblPr>
-      <w:tblGrid>
-        <w:gridCol w:w="3000"/>
-        <w:gridCol w:w="3000"/>
-        <w:gridCol w:w="3360"/>
-      </w:tblGrid>
-      <w:tr>
-        <w:trPr>
-          <w:tblHeader/>
-        </w:trPr>
-        <w:tc>
-          <w:tcPr>
-            <w:tcW w:w="3000" w:type="dxa"/>
-            <w:tcBorders>
-              <w:top w:val="single" w:sz="1" w:space="0" w:color="000000"/>
-              <w:left w:val="single" w:sz="1" w:space="0" w:color="000000"/>
-              <w:bottom w:val="single" w:sz="1" w:space="0" w:color="000000"/>
-              <w:right w:val="single" w:sz="1" w:space="0" w:color="000000"/>
-            </w:tcBorders>
-            <w:tcMar>
-              <w:top w:w="80" w:type="dxa"/>
-              <w:left w:w="100" w:type="dxa"/>
-              <w:bottom w:w="80" w:type="dxa"/>
-              <w:right w:w="100" w:type="dxa"/>
-            </w:tcMar>
-          </w:tcPr>
-          <w:p>
-            <w:r>
-              <w:rPr>
-                <w:b/>
-                <w:bCs/>
-                <w:sz w:val="20"/>
-                <w:szCs w:val="20"/>
-              </w:rPr>
-              <w:t>Tool / Software</w:t>
-            </w:r>
-          </w:p>
-        </w:tc>
-        <w:tc>
-          <w:tcPr>
-            <w:tcW w:w="3000" w:type="dxa"/>
-            <w:tcBorders>
-              <w:top w:val="single" w:sz="1" w:space="0" w:color="000000"/>
-              <w:left w:val="single" w:sz="1" w:space="0" w:color="000000"/>
-              <w:bottom w:val="single" w:sz="1" w:space="0" w:color="000000"/>
-              <w:right w:val="single" w:sz="1" w:space="0" w:color="000000"/>
-            </w:tcBorders>
-            <w:tcMar>
-              <w:top w:w="80" w:type="dxa"/>
-              <w:left w:w="100" w:type="dxa"/>
-              <w:bottom w:w="80" w:type="dxa"/>
-              <w:right w:w="100" w:type="dxa"/>
-            </w:tcMar>
-          </w:tcPr>
-          <w:p>
-            <w:r>
-              <w:rPr>
-                <w:b/>
-                <w:bCs/>
-                <w:sz w:val="20"/>
-                <w:szCs w:val="20"/>
-              </w:rPr>
-              <w:t>Version / Details</w:t>
-            </w:r>
-          </w:p>
-        </w:tc>
-        <w:tc>
-          <w:tcPr>
-            <w:tcW w:w="3360" w:type="dxa"/>
-            <w:tcBorders>
-              <w:top w:val="single" w:sz="1" w:space="0" w:color="000000"/>
-              <w:left w:val="single" w:sz="1" w:space="0" w:color="000000"/>
-              <w:bottom w:val="single" w:sz="1" w:space="0" w:color="000000"/>
-              <w:right w:val="single" w:sz="1" w:space="0" w:color="000000"/>
-            </w:tcBorders>
-            <w:tcMar>
-              <w:top w:w="80" w:type="dxa"/>
-              <w:left w:w="100" w:type="dxa"/>
-              <w:bottom w:w="80" w:type="dxa"/>
-              <w:right w:w="100" w:type="dxa"/>
-            </w:tcMar>
-          </w:tcPr>
-          <w:p>
-            <w:r>
-              <w:rPr>
-                <w:b/>
-                <w:bCs/>
-                <w:sz w:val="20"/>
-                <w:szCs w:val="20"/>
-              </w:rPr>
-              <w:t>Purpose</w:t>
-            </w:r>
-          </w:p>
-        </w:tc>
-      </w:tr>
-      <w:tr>
-        <w:tc>
-          <w:tcPr>
-            <w:tcW w:w="3000" w:type="dxa"/>
-            <w:tcBorders>
-              <w:top w:val="single" w:sz="1" w:space="0" w:color="000000"/>
-              <w:left w:val="single" w:sz="1" w:space="0" w:color="000000"/>
-              <w:bottom w:val="single" w:sz="1" w:space="0" w:color="000000"/>
-              <w:right w:val="single" w:sz="1" w:space="0" w:color="000000"/>
-            </w:tcBorders>
-            <w:tcMar>
-              <w:top w:w="80" w:type="dxa"/>
-              <w:left w:w="100" w:type="dxa"/>
-              <w:bottom w:w="80" w:type="dxa"/>
-              <w:right w:w="100" w:type="dxa"/>
-            </w:tcMar>
-          </w:tcPr>
-          <w:p>
-            <w:r>
-              <w:rPr>
-                <w:sz w:val="20"/>
-                <w:szCs w:val="20"/>
-              </w:rPr>
-              <w:t>Android Studio</w:t>
-            </w:r>
-          </w:p>
-        </w:tc>
-        <w:tc>
-          <w:tcPr>
-            <w:tcW w:w="3000" w:type="dxa"/>
-            <w:tcBorders>
-              <w:top w:val="single" w:sz="1" w:space="0" w:color="000000"/>
-              <w:left w:val="single" w:sz="1" w:space="0" w:color="000000"/>
-              <w:bottom w:val="single" w:sz="1" w:space="0" w:color="000000"/>
-              <w:right w:val="single" w:sz="1" w:space="0" w:color="000000"/>
-            </w:tcBorders>
-            <w:tcMar>
-              <w:top w:w="80" w:type="dxa"/>
-              <w:left w:w="100" w:type="dxa"/>
-              <w:bottom w:w="80" w:type="dxa"/>
-              <w:right w:w="100" w:type="dxa"/>
-            </w:tcMar>
-          </w:tcPr>
-          <w:p>
-            <w:r>
-              <w:rPr>
-                <w:sz w:val="20"/>
-                <w:szCs w:val="20"/>
-              </w:rPr>
-              <w:t>Latest Stable 2024+</w:t>
-            </w:r>
-          </w:p>
-        </w:tc>
-        <w:tc>
-          <w:tcPr>
-            <w:tcW w:w="3360" w:type="dxa"/>
-            <w:tcBorders>
-              <w:top w:val="single" w:sz="1" w:space="0" w:color="000000"/>
-              <w:left w:val="single" w:sz="1" w:space="0" w:color="000000"/>
-              <w:bottom w:val="single" w:sz="1" w:space="0" w:color="000000"/>
-              <w:right w:val="single" w:sz="1" w:space="0" w:color="000000"/>
-            </w:tcBorders>
-            <w:tcMar>
-              <w:top w:w="80" w:type="dxa"/>
-              <w:left w:w="100" w:type="dxa"/>
-              <w:bottom w:w="80" w:type="dxa"/>
-              <w:right w:w="100" w:type="dxa"/>
-            </w:tcMar>
-          </w:tcPr>
-          <w:p>
-            <w:r>
-              <w:rPr>
-                <w:sz w:val="20"/>
-                <w:szCs w:val="20"/>
-              </w:rPr>
-              <w:t>Primary development IDE</w:t>
-            </w:r>
-          </w:p>
-        </w:tc>
-      </w:tr>
-      <w:tr>
-        <w:tc>
-          <w:tcPr>
-            <w:tcW w:w="3000" w:type="dxa"/>
-            <w:tcBorders>
-              <w:top w:val="single" w:sz="1" w:space="0" w:color="000000"/>
-              <w:left w:val="single" w:sz="1" w:space="0" w:color="000000"/>
-              <w:bottom w:val="single" w:sz="1" w:space="0" w:color="000000"/>
-              <w:right w:val="single" w:sz="1" w:space="0" w:color="000000"/>
-            </w:tcBorders>
-            <w:tcMar>
-              <w:top w:w="80" w:type="dxa"/>
-              <w:left w:w="100" w:type="dxa"/>
-              <w:bottom w:w="80" w:type="dxa"/>
-              <w:right w:w="100" w:type="dxa"/>
-            </w:tcMar>
-          </w:tcPr>
-          <w:p>
-            <w:r>
-              <w:rPr>
-                <w:sz w:val="20"/>
-                <w:szCs w:val="20"/>
-              </w:rPr>
-              <w:t>Android SDK</w:t>
-            </w:r>
-          </w:p>
-        </w:tc>
-        <w:tc>
-          <w:tcPr>
-            <w:tcW w:w="3000" w:type="dxa"/>
-            <w:tcBorders>
-              <w:top w:val="single" w:sz="1" w:space="0" w:color="000000"/>
-              <w:left w:val="single" w:sz="1" w:space="0" w:color="000000"/>
-              <w:bottom w:val="single" w:sz="1" w:space="0" w:color="000000"/>
-              <w:right w:val="single" w:sz="1" w:space="0" w:color="000000"/>
-            </w:tcBorders>
-            <w:tcMar>
-              <w:top w:w="80" w:type="dxa"/>
-              <w:left w:w="100" w:type="dxa"/>
-              <w:bottom w:w="80" w:type="dxa"/>
-              <w:right w:w="100" w:type="dxa"/>
-            </w:tcMar>
-          </w:tcPr>
-          <w:p>
-            <w:r>
-              <w:rPr>
-                <w:sz w:val="20"/>
-                <w:szCs w:val="20"/>
-              </w:rPr>
-              <w:t>API 24 and API 34</w:t>
-            </w:r>
-          </w:p>
-        </w:tc>
-        <w:tc>
-          <w:tcPr>
-            <w:tcW w:w="3360" w:type="dxa"/>
-            <w:tcBorders>
-              <w:top w:val="single" w:sz="1" w:space="0" w:color="000000"/>
-              <w:left w:val="single" w:sz="1" w:space="0" w:color="000000"/>
-              <w:bottom w:val="single" w:sz="1" w:space="0" w:color="000000"/>
-              <w:right w:val="single" w:sz="1" w:space="0" w:color="000000"/>
-            </w:tcBorders>
-            <w:tcMar>
-              <w:top w:w="80" w:type="dxa"/>
-              <w:left w:w="100" w:type="dxa"/>
-              <w:bottom w:w="80" w:type="dxa"/>
-              <w:right w:w="100" w:type="dxa"/>
-            </w:tcMar>
-          </w:tcPr>
-          <w:p>
-            <w:r>
-              <w:rPr>
-                <w:sz w:val="20"/>
-                <w:szCs w:val="20"/>
-              </w:rPr>
-              <w:t>Android platform libraries</w:t>
-            </w:r>
-          </w:p>
-        </w:tc>
-      </w:tr>
-      <w:tr>
-        <w:tc>
-          <w:tcPr>
-            <w:tcW w:w="3000" w:type="dxa"/>
-            <w:tcBorders>
-              <w:top w:val="single" w:sz="1" w:space="0" w:color="000000"/>
-              <w:left w:val="single" w:sz="1" w:space="0" w:color="000000"/>
-              <w:bottom w:val="single" w:sz="1" w:space="0" w:color="000000"/>
-              <w:right w:val="single" w:sz="1" w:space="0" w:color="000000"/>
-            </w:tcBorders>
-            <w:tcMar>
-              <w:top w:w="80" w:type="dxa"/>
-              <w:left w:w="100" w:type="dxa"/>
-              <w:bottom w:w="80" w:type="dxa"/>
-              <w:right w:w="100" w:type="dxa"/>
-            </w:tcMar>
-          </w:tcPr>
-          <w:p>
-            <w:r>
-              <w:rPr>
-                <w:sz w:val="20"/>
-                <w:szCs w:val="20"/>
-              </w:rPr>
-              <w:t>Git</w:t>
-            </w:r>
-          </w:p>
-        </w:tc>
-        <w:tc>
-          <w:tcPr>
-            <w:tcW w:w="3000" w:type="dxa"/>
-            <w:tcBorders>
-              <w:top w:val="single" w:sz="1" w:space="0" w:color="000000"/>
-              <w:left w:val="single" w:sz="1" w:space="0" w:color="000000"/>
-              <w:bottom w:val="single" w:sz="1" w:space="0" w:color="000000"/>
-              <w:right w:val="single" w:sz="1" w:space="0" w:color="000000"/>
-            </w:tcBorders>
-            <w:tcMar>
-              <w:top w:w="80" w:type="dxa"/>
-              <w:left w:w="100" w:type="dxa"/>
-              <w:bottom w:w="80" w:type="dxa"/>
-              <w:right w:w="100" w:type="dxa"/>
-            </w:tcMar>
-          </w:tcPr>
-          <w:p>
-            <w:r>
-              <w:rPr>
-                <w:sz w:val="20"/>
-                <w:szCs w:val="20"/>
-              </w:rPr>
-              <w:t>Latest version</w:t>
-            </w:r>
-          </w:p>
-        </w:tc>
-        <w:tc>
-          <w:tcPr>
-            <w:tcW w:w="3360" w:type="dxa"/>
-            <w:tcBorders>
-              <w:top w:val="single" w:sz="1" w:space="0" w:color="000000"/>
-              <w:left w:val="single" w:sz="1" w:space="0" w:color="000000"/>
-              <w:bottom w:val="single" w:sz="1" w:space="0" w:color="000000"/>
-              <w:right w:val="single" w:sz="1" w:space="0" w:color="000000"/>
-            </w:tcBorders>
-            <w:tcMar>
-              <w:top w:w="80" w:type="dxa"/>
-              <w:left w:w="100" w:type="dxa"/>
-              <w:bottom w:w="80" w:type="dxa"/>
-              <w:right w:w="100" w:type="dxa"/>
-            </w:tcMar>
-          </w:tcPr>
-          <w:p>
-            <w:r>
-              <w:rPr>
-                <w:sz w:val="20"/>
-                <w:szCs w:val="20"/>
-              </w:rPr>
-              <w:t>Version control</w:t>
-            </w:r>
-          </w:p>
-        </w:tc>
-      </w:tr>
-      <w:tr>
-        <w:tc>
-          <w:tcPr>
-            <w:tcW w:w="3000" w:type="dxa"/>
-            <w:tcBorders>
-              <w:top w:val="single" w:sz="1" w:space="0" w:color="000000"/>
-              <w:left w:val="single" w:sz="1" w:space="0" w:color="000000"/>
-              <w:bottom w:val="single" w:sz="1" w:space="0" w:color="000000"/>
-              <w:right w:val="single" w:sz="1" w:space="0" w:color="000000"/>
-            </w:tcBorders>
-            <w:tcMar>
-              <w:top w:w="80" w:type="dxa"/>
-              <w:left w:w="100" w:type="dxa"/>
-              <w:bottom w:w="80" w:type="dxa"/>
-              <w:right w:w="100" w:type="dxa"/>
-            </w:tcMar>
-          </w:tcPr>
-          <w:p>
-            <w:r>
-              <w:rPr>
-                <w:sz w:val="20"/>
-                <w:szCs w:val="20"/>
-              </w:rPr>
-              <w:t>GitHub</w:t>
-            </w:r>
-          </w:p>
-        </w:tc>
-        <w:tc>
-          <w:tcPr>
-            <w:tcW w:w="3000" w:type="dxa"/>
-            <w:tcBorders>
-              <w:top w:val="single" w:sz="1" w:space="0" w:color="000000"/>
-              <w:left w:val="single" w:sz="1" w:space="0" w:color="000000"/>
-              <w:bottom w:val="single" w:sz="1" w:space="0" w:color="000000"/>
-              <w:right w:val="single" w:sz="1" w:space="0" w:color="000000"/>
-            </w:tcBorders>
-            <w:tcMar>
-              <w:top w:w="80" w:type="dxa"/>
-              <w:left w:w="100" w:type="dxa"/>
-              <w:bottom w:w="80" w:type="dxa"/>
-              <w:right w:w="100" w:type="dxa"/>
-            </w:tcMar>
-          </w:tcPr>
-          <w:p>
-            <w:r>
-              <w:rPr>
-                <w:sz w:val="20"/>
-                <w:szCs w:val="20"/>
-              </w:rPr>
-              <w:t>github.com</w:t>
-            </w:r>
-          </w:p>
-        </w:tc>
-        <w:tc>
-          <w:tcPr>
-            <w:tcW w:w="3360" w:type="dxa"/>
-            <w:tcBorders>
-              <w:top w:val="single" w:sz="1" w:space="0" w:color="000000"/>
-              <w:left w:val="single" w:sz="1" w:space="0" w:color="000000"/>
-              <w:bottom w:val="single" w:sz="1" w:space="0" w:color="000000"/>
-              <w:right w:val="single" w:sz="1" w:space="0" w:color="000000"/>
-            </w:tcBorders>
-            <w:tcMar>
-              <w:top w:w="80" w:type="dxa"/>
-              <w:left w:w="100" w:type="dxa"/>
-              <w:bottom w:w="80" w:type="dxa"/>
-              <w:right w:w="100" w:type="dxa"/>
-            </w:tcMar>
-          </w:tcPr>
-          <w:p>
-            <w:r>
-              <w:rPr>
-                <w:sz w:val="20"/>
-                <w:szCs w:val="20"/>
-              </w:rPr>
-              <w:t>Remote repository hosting</w:t>
-            </w:r>
-          </w:p>
-        </w:tc>
-      </w:tr>
-      <w:tr>
-        <w:tc>
-          <w:tcPr>
-            <w:tcW w:w="3000" w:type="dxa"/>
-            <w:tcBorders>
-              <w:top w:val="single" w:sz="1" w:space="0" w:color="000000"/>
-              <w:left w:val="single" w:sz="1" w:space="0" w:color="000000"/>
-              <w:bottom w:val="single" w:sz="1" w:space="0" w:color="000000"/>
-              <w:right w:val="single" w:sz="1" w:space="0" w:color="000000"/>
-            </w:tcBorders>
-            <w:tcMar>
-              <w:top w:w="80" w:type="dxa"/>
-              <w:left w:w="100" w:type="dxa"/>
-              <w:bottom w:w="80" w:type="dxa"/>
-              <w:right w:w="100" w:type="dxa"/>
-            </w:tcMar>
-          </w:tcPr>
-          <w:p>
-            <w:r>
-              <w:rPr>
-                <w:sz w:val="20"/>
-                <w:szCs w:val="20"/>
-              </w:rPr>
-              <w:t>Android Phone</w:t>
-            </w:r>
-          </w:p>
-        </w:tc>
-        <w:tc>
-          <w:tcPr>
-            <w:tcW w:w="3000" w:type="dxa"/>
-            <w:tcBorders>
-              <w:top w:val="single" w:sz="1" w:space="0" w:color="000000"/>
-              <w:left w:val="single" w:sz="1" w:space="0" w:color="000000"/>
-              <w:bottom w:val="single" w:sz="1" w:space="0" w:color="000000"/>
-              <w:right w:val="single" w:sz="1" w:space="0" w:color="000000"/>
-            </w:tcBorders>
-            <w:tcMar>
-              <w:top w:w="80" w:type="dxa"/>
-              <w:left w:w="100" w:type="dxa"/>
-              <w:bottom w:w="80" w:type="dxa"/>
-              <w:right w:w="100" w:type="dxa"/>
-            </w:tcMar>
-          </w:tcPr>
-          <w:p>
-            <w:r>
-              <w:rPr>
-                <w:sz w:val="20"/>
-                <w:szCs w:val="20"/>
-              </w:rPr>
-              <w:t>USB connected</w:t>
-            </w:r>
-          </w:p>
-        </w:tc>
-        <w:tc>
-          <w:tcPr>
-            <w:tcW w:w="3360" w:type="dxa"/>
-            <w:tcBorders>
-              <w:top w:val="single" w:sz="1" w:space="0" w:color="000000"/>
-              <w:left w:val="single" w:sz="1" w:space="0" w:color="000000"/>
-              <w:bottom w:val="single" w:sz="1" w:space="0" w:color="000000"/>
-              <w:right w:val="single" w:sz="1" w:space="0" w:color="000000"/>
-            </w:tcBorders>
-            <w:tcMar>
-              <w:top w:w="80" w:type="dxa"/>
-              <w:left w:w="100" w:type="dxa"/>
-              <w:bottom w:w="80" w:type="dxa"/>
-              <w:right w:w="100" w:type="dxa"/>
-            </w:tcMar>
-          </w:tcPr>
-          <w:p>
-            <w:r>
-              <w:rPr>
-                <w:sz w:val="20"/>
-                <w:szCs w:val="20"/>
-              </w:rPr>
-              <w:t>Real device for testing</w:t>
-            </w:r>
-          </w:p>
-        </w:tc>
-      </w:tr>
-    </w:tbl>
-    <w:p>
-      <w:pPr>
-        <w:spacing w:before="80" w:after="80"/>
-      </w:pPr>
-      <w:r>
-        <w:t xml:space="preserve"> </w:t>
-      </w:r>
-    </w:p>
-    <w:p>
-      <w:pPr>
-        <w:spacing w:before="200" w:after="100"/>
-      </w:pPr>
-      <w:r>
-        <w:rPr>
-          <w:b/>
-          <w:bCs/>
-          <w:sz w:val="24"/>
-          <w:szCs w:val="24"/>
-        </w:rPr>
-        <w:t>Personal Reflection</w:t>
-      </w:r>
-    </w:p>
-    <w:p>
-      <w:pPr>
-        <w:spacing w:before="60" w:after="60"/>
-      </w:pPr>
-      <w:r>
-        <w:t>(Not more than 50 words)</w:t>
-      </w:r>
-    </w:p>
-    <w:p>
-      <w:pPr>
-        <w:spacing w:before="80" w:after="80"/>
-      </w:pPr>
-      <w:r>
-        <w:t xml:space="preserve"> </w:t>
-      </w:r>
-    </w:p>
-    <w:tbl>
-      <w:tblPr>
-        <w:tblW w:w="9360" w:type="dxa"/>
-        <w:tblBorders>
-          <w:top w:val="single" w:sz="4" w:space="0" w:color="auto"/>
-          <w:left w:val="single" w:sz="4" w:space="0" w:color="auto"/>
-          <w:bottom w:val="single" w:sz="4" w:space="0" w:color="auto"/>
-          <w:right w:val="single" w:sz="4" w:space="0" w:color="auto"/>
-          <w:insideH w:val="single" w:sz="4" w:space="0" w:color="auto"/>
-          <w:insideV w:val="single" w:sz="4" w:space="0" w:color="auto"/>
-        </w:tblBorders>
-        <w:tblCellMar>
-          <w:left w:w="10" w:type="dxa"/>
-          <w:right w:w="10" w:type="dxa"/>
-        </w:tblCellMar>
-        <w:tblLook w:val="04A0" w:firstRow="1" w:lastRow="0" w:firstColumn="1" w:lastColumn="0" w:noHBand="0" w:noVBand="1"/>
-      </w:tblPr>
-      <w:tblGrid>
-        <w:gridCol w:w="9360"/>
-      </w:tblGrid>
-      <w:tr>
-        <w:tc>
-          <w:tcPr>
-            <w:tcW w:w="0" w:type="auto"/>
-            <w:tcBorders>
-              <w:top w:val="single" w:sz="1" w:space="0" w:color="000000"/>
-              <w:left w:val="single" w:sz="1" w:space="0" w:color="000000"/>
-              <w:bottom w:val="single" w:sz="1" w:space="0" w:color="000000"/>
-              <w:right w:val="single" w:sz="1" w:space="0" w:color="000000"/>
-            </w:tcBorders>
-            <w:tcMar>
-              <w:top w:w="120" w:type="dxa"/>
-              <w:left w:w="160" w:type="dxa"/>
-              <w:bottom w:w="600" w:type="dxa"/>
-              <w:right w:w="160" w:type="dxa"/>
-            </w:tcMar>
-          </w:tcPr>
-          <w:p/>
-        </w:tc>
-      </w:tr>
-    </w:tbl>
-    <w:p>
-      <w:r>
-        <w:br w:type="page"/>
-      </w:r>
-    </w:p>
-    <w:p>
-      <w:pPr>
-        <w:spacing w:before="320" w:after="160"/>
-      </w:pPr>
-      <w:r>
-        <w:rPr>
-          <w:b/>
-          <w:bCs/>
-          <w:sz w:val="26"/>
-          <w:szCs w:val="26"/>
-        </w:rPr>
-        <w:lastRenderedPageBreak/>
-        <w:t>WEEK 2: Mobile Development Environment</w:t>
-      </w:r>
-    </w:p>
-    <w:p>
-      <w:pPr>
-        <w:spacing w:before="80" w:after="80"/>
-      </w:pPr>
-      <w:r>
-        <w:t xml:space="preserve"> </w:t>
-      </w:r>
-    </w:p>
-    <w:p>
-      <w:pPr>
-        <w:spacing w:before="200" w:after="100"/>
-      </w:pPr>
-      <w:r>
-        <w:rPr>
-          <w:b/>
-          <w:bCs/>
-          <w:sz w:val="24"/>
-          <w:szCs w:val="24"/>
-        </w:rPr>
-        <w:t>Practical Activities Undertaken</w:t>
-      </w:r>
-    </w:p>
-    <w:p>
-      <w:pPr>
-        <w:pStyle w:val="ListParagraph"/>
-        <w:numPr>
-          <w:ilvl w:val="0"/>
-          <w:numId w:val="2"/>
-        </w:numPr>
-        <w:spacing w:before="40" w:after="40"/>
-      </w:pPr>
-      <w:r>
-        <w:t xml:space="preserve">Created new Android project: Name = SpareDash, Package = </w:t>
-      </w:r>
-      <w:proofErr w:type="spellStart"/>
-      <w:r>
-        <w:t>com.sparedash.app</w:t>
-      </w:r>
-      <w:proofErr w:type="spellEnd"/>
-      <w:r>
-        <w:t>, Language = Kotlin, Min SDK = API 24.</w:t>
-      </w:r>
-    </w:p>
-    <w:p>
-      <w:pPr>
-        <w:pStyle w:val="ListParagraph"/>
-        <w:numPr>
-          <w:ilvl w:val="0"/>
-          <w:numId w:val="2"/>
-        </w:numPr>
-        <w:spacing w:before="40" w:after="40"/>
-      </w:pPr>
-      <w:r>
-        <w:t>Confirmed Gradle sync completed successfully.</w:t>
-      </w:r>
-    </w:p>
-    <w:p>
-      <w:pPr>
-        <w:pStyle w:val="ListParagraph"/>
-        <w:numPr>
-          <w:ilvl w:val="0"/>
-          <w:numId w:val="2"/>
-        </w:numPr>
-        <w:spacing w:before="40" w:after="40"/>
-      </w:pPr>
-      <w:r>
-        <w:t>Explored the generated project folder structure: java/, res/layout/, res/values/, AndroidManifest.xml.</w:t>
-      </w:r>
-    </w:p>
-    <w:p>
-      <w:pPr>
-        <w:pStyle w:val="ListParagraph"/>
-        <w:numPr>
-          <w:ilvl w:val="0"/>
-          <w:numId w:val="2"/>
-        </w:numPr>
-        <w:spacing w:before="40" w:after="40"/>
-      </w:pPr>
-      <w:r>
-        <w:t>Added all required Gradle dependencies: Room, Navigation Component, ViewModel, LiveData, Glide, Coroutines, Material Design.</w:t>
-      </w:r>
-    </w:p>
-    <w:p>
-      <w:pPr>
-        <w:pStyle w:val="ListParagraph"/>
-        <w:numPr>
-          <w:ilvl w:val="0"/>
-          <w:numId w:val="2"/>
-        </w:numPr>
-        <w:spacing w:before="40" w:after="40"/>
-      </w:pPr>
-      <w:r>
-        <w:t xml:space="preserve">Created package folders: data/, ui/, viewmodel/, utils/ inside </w:t>
-      </w:r>
-      <w:proofErr w:type="spellStart"/>
-      <w:r>
-        <w:t>com.sparedash.app</w:t>
-      </w:r>
-      <w:proofErr w:type="spellEnd"/>
-      <w:r>
-        <w:t>.</w:t>
-      </w:r>
-    </w:p>
-    <w:p>
-      <w:pPr>
-        <w:pStyle w:val="ListParagraph"/>
-        <w:numPr>
-          <w:ilvl w:val="0"/>
-          <w:numId w:val="2"/>
-        </w:numPr>
-        <w:spacing w:before="40" w:after="40"/>
-      </w:pPr>
-      <w:r>
-        <w:t xml:space="preserve">Defined app </w:t>
-      </w:r>
-      <w:proofErr w:type="spellStart"/>
-      <w:r>
-        <w:t>colour</w:t>
-      </w:r>
-      <w:proofErr w:type="spellEnd"/>
-      <w:r>
-        <w:t xml:space="preserve"> scheme in res/values/colors.xml.</w:t>
-      </w:r>
-    </w:p>
-    <w:p>
-      <w:pPr>
-        <w:pStyle w:val="ListParagraph"/>
-        <w:numPr>
-          <w:ilvl w:val="0"/>
-          <w:numId w:val="2"/>
-        </w:numPr>
-        <w:spacing w:before="40" w:after="40"/>
-      </w:pPr>
-      <w:r>
-        <w:t>Configured AndroidManifest.xml: app name, theme, INTERNET permission.</w:t>
-      </w:r>
-    </w:p>
-    <w:p>
-      <w:pPr>
-        <w:pStyle w:val="ListParagraph"/>
-        <w:numPr>
-          <w:ilvl w:val="0"/>
-          <w:numId w:val="2"/>
-        </w:numPr>
-        <w:spacing w:before="40" w:after="40"/>
-      </w:pPr>
-      <w:r>
-        <w:t>Ran the default Hello World app on the connected Android phone via USB.</w:t>
-      </w:r>
-    </w:p>
-    <w:p>
-      <w:pPr>
-        <w:pStyle w:val="ListParagraph"/>
-        <w:numPr>
-          <w:ilvl w:val="0"/>
-          <w:numId w:val="2"/>
-        </w:numPr>
-        <w:spacing w:before="40" w:after="40"/>
-      </w:pPr>
-      <w:r>
-        <w:t>Made first GitHub commit: "Initial commit: SpareDash project setup".</w:t>
-      </w:r>
-    </w:p>
-    <w:p>
-      <w:pPr>
-        <w:spacing w:before="80" w:after="80"/>
-      </w:pPr>
-      <w:r>
-        <w:t xml:space="preserve"> </w:t>
-      </w:r>
-    </w:p>
-    <w:p>
-      <w:pPr>
-        <w:spacing w:before="200" w:after="100"/>
-      </w:pPr>
-      <w:r>
-        <w:rPr>
-          <w:b/>
-          <w:bCs/>
-          <w:sz w:val="24"/>
-          <w:szCs w:val="24"/>
-        </w:rPr>
-        <w:t>Screenshots / Evidence</w:t>
-      </w:r>
-    </w:p>
-    <w:p>
-      <w:pPr>
-        <w:spacing w:before="60" w:after="60"/>
-      </w:pPr>
-      <w:r>
-        <w:t xml:space="preserve">Screenshots Attached: Yes / </w:t>
-      </w:r>
-      <w:proofErr w:type="gramStart"/>
-      <w:r>
-        <w:t>No  (</w:t>
-      </w:r>
-      <w:proofErr w:type="gramEnd"/>
-      <w:r>
-        <w:t>circle one)</w:t>
-      </w:r>
-    </w:p>
-    <w:p>
-      <w:pPr>
-        <w:spacing w:before="80" w:after="80"/>
-      </w:pPr>
-      <w:r>
-        <w:t xml:space="preserve"> </w:t>
-      </w:r>
-    </w:p>
-    <w:tbl>
-      <w:tblPr>
-        <w:tblW w:w="9360" w:type="dxa"/>
-        <w:tblBorders>
-          <w:top w:val="single" w:sz="4" w:space="0" w:color="auto"/>
-          <w:left w:val="single" w:sz="4" w:space="0" w:color="auto"/>
-          <w:bottom w:val="single" w:sz="4" w:space="0" w:color="auto"/>
-          <w:right w:val="single" w:sz="4" w:space="0" w:color="auto"/>
-          <w:insideH w:val="single" w:sz="4" w:space="0" w:color="auto"/>
-          <w:insideV w:val="single" w:sz="4" w:space="0" w:color="auto"/>
-        </w:tblBorders>
-        <w:tblCellMar>
-          <w:left w:w="10" w:type="dxa"/>
-          <w:right w:w="10" w:type="dxa"/>
-        </w:tblCellMar>
-        <w:tblLook w:val="04A0" w:firstRow="1" w:lastRow="0" w:firstColumn="1" w:lastColumn="0" w:noHBand="0" w:noVBand="1"/>
-      </w:tblPr>
-      <w:tblGrid>
-        <w:gridCol w:w="9760"/>
-      </w:tblGrid>
-      <w:tr>
-        <w:tc>
-          <w:tcPr>
-            <w:tcW w:w="0" w:type="auto"/>
-            <w:tcBorders>
-              <w:top w:val="dashed" w:sz="2" w:space="0" w:color="000000"/>
-              <w:left w:val="dashed" w:sz="2" w:space="0" w:color="000000"/>
-              <w:bottom w:val="dashed" w:sz="2" w:space="0" w:color="000000"/>
-              <w:right w:val="dashed" w:sz="2" w:space="0" w:color="000000"/>
-            </w:tcBorders>
-            <w:tcMar>
-              <w:top w:w="300" w:type="dxa"/>
-              <w:left w:w="200" w:type="dxa"/>
-              <w:bottom w:w="300" w:type="dxa"/>
-              <w:right w:w="200" w:type="dxa"/>
-            </w:tcMar>
-          </w:tcPr>
-          <w:p>
-            <w:pPr>
-              <w:jc w:val="center"/>
-            </w:pPr>
-            <w:r>
-              <w:rPr>
-                <w:b/>
-                <w:bCs/>
-                <w:sz w:val="20"/>
-                <w:szCs w:val="20"/>
-              </w:rPr>
-              <w:t>Screenshot: SpareDash project open in Android Studio showing folder structure</w:t>
-            </w:r>
-          </w:p>
-          <w:p>
-            <w:pPr>
-              <w:jc w:val="center"/>
-            </w:pPr>
             <w:r>
               <w:rPr>
                 <w:noProof/>
               </w:rPr>
               <w:drawing>
-                <wp:inline distT="0" distB="0" distL="0" distR="0" wp14:anchorId="5EE09BEC" wp14:editId="2557D366">
+                <wp:inline distT="0" distB="0" distL="0" distR="0" wp14:anchorId="64BE55DA" wp14:editId="024A79C4">
                   <wp:extent cx="5943600" cy="3157855"/>
                   <wp:effectExtent l="0" t="0" r="0" b="4445"/>
-                  <wp:docPr id="1664994744" name="Picture 5"/>
+                  <wp:docPr id="1023603572" name="Picture 6"/>
                   <wp:cNvGraphicFramePr>
                     <a:graphicFrameLocks xmlns:a="http://schemas.openxmlformats.org/drawingml/2006/main" noChangeAspect="1"/>
                   </wp:cNvGraphicFramePr>
@@ -2337,7 +1424,7 @@
                     <a:graphicData uri="http://schemas.openxmlformats.org/drawingml/2006/picture">
                       <pic:pic xmlns:pic="http://schemas.openxmlformats.org/drawingml/2006/picture">
                         <pic:nvPicPr>
-                          <pic:cNvPr id="0" name="Picture 9"/>
+                          <pic:cNvPr id="0" name="Picture 23"/>
                           <pic:cNvPicPr>
                             <a:picLocks noChangeAspect="1" noChangeArrowheads="1"/>
                           </pic:cNvPicPr>
@@ -2386,6 +1473,794 @@
         <w:t xml:space="preserve"> </w:t>
       </w:r>
     </w:p>
+    <w:p>
+      <w:pPr>
+        <w:spacing w:before="200" w:after="100"/>
+      </w:pPr>
+      <w:r>
+        <w:rPr>
+          <w:b/>
+          <w:bCs/>
+          <w:sz w:val="24"/>
+          <w:szCs w:val="24"/>
+        </w:rPr>
+        <w:t>Tools / Software Used</w:t>
+      </w:r>
+    </w:p>
+    <w:p>
+      <w:pPr>
+        <w:spacing w:before="80" w:after="80"/>
+      </w:pPr>
+      <w:r>
+        <w:t xml:space="preserve"> </w:t>
+      </w:r>
+    </w:p>
+    <w:tbl>
+      <w:tblPr>
+        <w:tblW w:w="9360" w:type="dxa"/>
+        <w:tblBorders>
+          <w:top w:val="single" w:sz="4" w:space="0" w:color="auto"/>
+          <w:left w:val="single" w:sz="4" w:space="0" w:color="auto"/>
+          <w:bottom w:val="single" w:sz="4" w:space="0" w:color="auto"/>
+          <w:right w:val="single" w:sz="4" w:space="0" w:color="auto"/>
+          <w:insideH w:val="single" w:sz="4" w:space="0" w:color="auto"/>
+          <w:insideV w:val="single" w:sz="4" w:space="0" w:color="auto"/>
+        </w:tblBorders>
+        <w:tblCellMar>
+          <w:left w:w="10" w:type="dxa"/>
+          <w:right w:w="10" w:type="dxa"/>
+        </w:tblCellMar>
+        <w:tblLook w:val="04A0" w:firstRow="1" w:lastRow="0" w:firstColumn="1" w:lastColumn="0" w:noHBand="0" w:noVBand="1"/>
+      </w:tblPr>
+      <w:tblGrid>
+        <w:gridCol w:w="3000"/>
+        <w:gridCol w:w="3000"/>
+        <w:gridCol w:w="3360"/>
+      </w:tblGrid>
+      <w:tr>
+        <w:trPr>
+          <w:tblHeader/>
+        </w:trPr>
+        <w:tc>
+          <w:tcPr>
+            <w:tcW w:w="3000" w:type="dxa"/>
+            <w:tcBorders>
+              <w:top w:val="single" w:sz="1" w:space="0" w:color="000000"/>
+              <w:left w:val="single" w:sz="1" w:space="0" w:color="000000"/>
+              <w:bottom w:val="single" w:sz="1" w:space="0" w:color="000000"/>
+              <w:right w:val="single" w:sz="1" w:space="0" w:color="000000"/>
+            </w:tcBorders>
+            <w:tcMar>
+              <w:top w:w="80" w:type="dxa"/>
+              <w:left w:w="100" w:type="dxa"/>
+              <w:bottom w:w="80" w:type="dxa"/>
+              <w:right w:w="100" w:type="dxa"/>
+            </w:tcMar>
+          </w:tcPr>
+          <w:p>
+            <w:r>
+              <w:rPr>
+                <w:b/>
+                <w:bCs/>
+                <w:sz w:val="20"/>
+                <w:szCs w:val="20"/>
+              </w:rPr>
+              <w:t>Tool / Software</w:t>
+            </w:r>
+          </w:p>
+        </w:tc>
+        <w:tc>
+          <w:tcPr>
+            <w:tcW w:w="3000" w:type="dxa"/>
+            <w:tcBorders>
+              <w:top w:val="single" w:sz="1" w:space="0" w:color="000000"/>
+              <w:left w:val="single" w:sz="1" w:space="0" w:color="000000"/>
+              <w:bottom w:val="single" w:sz="1" w:space="0" w:color="000000"/>
+              <w:right w:val="single" w:sz="1" w:space="0" w:color="000000"/>
+            </w:tcBorders>
+            <w:tcMar>
+              <w:top w:w="80" w:type="dxa"/>
+              <w:left w:w="100" w:type="dxa"/>
+              <w:bottom w:w="80" w:type="dxa"/>
+              <w:right w:w="100" w:type="dxa"/>
+            </w:tcMar>
+          </w:tcPr>
+          <w:p>
+            <w:r>
+              <w:rPr>
+                <w:b/>
+                <w:bCs/>
+                <w:sz w:val="20"/>
+                <w:szCs w:val="20"/>
+              </w:rPr>
+              <w:t>Version / Details</w:t>
+            </w:r>
+          </w:p>
+        </w:tc>
+        <w:tc>
+          <w:tcPr>
+            <w:tcW w:w="3360" w:type="dxa"/>
+            <w:tcBorders>
+              <w:top w:val="single" w:sz="1" w:space="0" w:color="000000"/>
+              <w:left w:val="single" w:sz="1" w:space="0" w:color="000000"/>
+              <w:bottom w:val="single" w:sz="1" w:space="0" w:color="000000"/>
+              <w:right w:val="single" w:sz="1" w:space="0" w:color="000000"/>
+            </w:tcBorders>
+            <w:tcMar>
+              <w:top w:w="80" w:type="dxa"/>
+              <w:left w:w="100" w:type="dxa"/>
+              <w:bottom w:w="80" w:type="dxa"/>
+              <w:right w:w="100" w:type="dxa"/>
+            </w:tcMar>
+          </w:tcPr>
+          <w:p>
+            <w:r>
+              <w:rPr>
+                <w:b/>
+                <w:bCs/>
+                <w:sz w:val="20"/>
+                <w:szCs w:val="20"/>
+              </w:rPr>
+              <w:t>Purpose</w:t>
+            </w:r>
+          </w:p>
+        </w:tc>
+      </w:tr>
+      <w:tr>
+        <w:tc>
+          <w:tcPr>
+            <w:tcW w:w="3000" w:type="dxa"/>
+            <w:tcBorders>
+              <w:top w:val="single" w:sz="1" w:space="0" w:color="000000"/>
+              <w:left w:val="single" w:sz="1" w:space="0" w:color="000000"/>
+              <w:bottom w:val="single" w:sz="1" w:space="0" w:color="000000"/>
+              <w:right w:val="single" w:sz="1" w:space="0" w:color="000000"/>
+            </w:tcBorders>
+            <w:tcMar>
+              <w:top w:w="80" w:type="dxa"/>
+              <w:left w:w="100" w:type="dxa"/>
+              <w:bottom w:w="80" w:type="dxa"/>
+              <w:right w:w="100" w:type="dxa"/>
+            </w:tcMar>
+          </w:tcPr>
+          <w:p>
+            <w:r>
+              <w:rPr>
+                <w:sz w:val="20"/>
+                <w:szCs w:val="20"/>
+              </w:rPr>
+              <w:t>Android Studio</w:t>
+            </w:r>
+          </w:p>
+        </w:tc>
+        <w:tc>
+          <w:tcPr>
+            <w:tcW w:w="3000" w:type="dxa"/>
+            <w:tcBorders>
+              <w:top w:val="single" w:sz="1" w:space="0" w:color="000000"/>
+              <w:left w:val="single" w:sz="1" w:space="0" w:color="000000"/>
+              <w:bottom w:val="single" w:sz="1" w:space="0" w:color="000000"/>
+              <w:right w:val="single" w:sz="1" w:space="0" w:color="000000"/>
+            </w:tcBorders>
+            <w:tcMar>
+              <w:top w:w="80" w:type="dxa"/>
+              <w:left w:w="100" w:type="dxa"/>
+              <w:bottom w:w="80" w:type="dxa"/>
+              <w:right w:w="100" w:type="dxa"/>
+            </w:tcMar>
+          </w:tcPr>
+          <w:p>
+            <w:r>
+              <w:rPr>
+                <w:sz w:val="20"/>
+                <w:szCs w:val="20"/>
+              </w:rPr>
+              <w:t>Latest Stable 2024+</w:t>
+            </w:r>
+          </w:p>
+        </w:tc>
+        <w:tc>
+          <w:tcPr>
+            <w:tcW w:w="3360" w:type="dxa"/>
+            <w:tcBorders>
+              <w:top w:val="single" w:sz="1" w:space="0" w:color="000000"/>
+              <w:left w:val="single" w:sz="1" w:space="0" w:color="000000"/>
+              <w:bottom w:val="single" w:sz="1" w:space="0" w:color="000000"/>
+              <w:right w:val="single" w:sz="1" w:space="0" w:color="000000"/>
+            </w:tcBorders>
+            <w:tcMar>
+              <w:top w:w="80" w:type="dxa"/>
+              <w:left w:w="100" w:type="dxa"/>
+              <w:bottom w:w="80" w:type="dxa"/>
+              <w:right w:w="100" w:type="dxa"/>
+            </w:tcMar>
+          </w:tcPr>
+          <w:p>
+            <w:r>
+              <w:rPr>
+                <w:sz w:val="20"/>
+                <w:szCs w:val="20"/>
+              </w:rPr>
+              <w:t>Primary development IDE</w:t>
+            </w:r>
+          </w:p>
+        </w:tc>
+      </w:tr>
+      <w:tr>
+        <w:tc>
+          <w:tcPr>
+            <w:tcW w:w="3000" w:type="dxa"/>
+            <w:tcBorders>
+              <w:top w:val="single" w:sz="1" w:space="0" w:color="000000"/>
+              <w:left w:val="single" w:sz="1" w:space="0" w:color="000000"/>
+              <w:bottom w:val="single" w:sz="1" w:space="0" w:color="000000"/>
+              <w:right w:val="single" w:sz="1" w:space="0" w:color="000000"/>
+            </w:tcBorders>
+            <w:tcMar>
+              <w:top w:w="80" w:type="dxa"/>
+              <w:left w:w="100" w:type="dxa"/>
+              <w:bottom w:w="80" w:type="dxa"/>
+              <w:right w:w="100" w:type="dxa"/>
+            </w:tcMar>
+          </w:tcPr>
+          <w:p>
+            <w:r>
+              <w:rPr>
+                <w:sz w:val="20"/>
+                <w:szCs w:val="20"/>
+              </w:rPr>
+              <w:t>Android SDK</w:t>
+            </w:r>
+          </w:p>
+        </w:tc>
+        <w:tc>
+          <w:tcPr>
+            <w:tcW w:w="3000" w:type="dxa"/>
+            <w:tcBorders>
+              <w:top w:val="single" w:sz="1" w:space="0" w:color="000000"/>
+              <w:left w:val="single" w:sz="1" w:space="0" w:color="000000"/>
+              <w:bottom w:val="single" w:sz="1" w:space="0" w:color="000000"/>
+              <w:right w:val="single" w:sz="1" w:space="0" w:color="000000"/>
+            </w:tcBorders>
+            <w:tcMar>
+              <w:top w:w="80" w:type="dxa"/>
+              <w:left w:w="100" w:type="dxa"/>
+              <w:bottom w:w="80" w:type="dxa"/>
+              <w:right w:w="100" w:type="dxa"/>
+            </w:tcMar>
+          </w:tcPr>
+          <w:p>
+            <w:r>
+              <w:rPr>
+                <w:sz w:val="20"/>
+                <w:szCs w:val="20"/>
+              </w:rPr>
+              <w:t>API 24 and API 34</w:t>
+            </w:r>
+          </w:p>
+        </w:tc>
+        <w:tc>
+          <w:tcPr>
+            <w:tcW w:w="3360" w:type="dxa"/>
+            <w:tcBorders>
+              <w:top w:val="single" w:sz="1" w:space="0" w:color="000000"/>
+              <w:left w:val="single" w:sz="1" w:space="0" w:color="000000"/>
+              <w:bottom w:val="single" w:sz="1" w:space="0" w:color="000000"/>
+              <w:right w:val="single" w:sz="1" w:space="0" w:color="000000"/>
+            </w:tcBorders>
+            <w:tcMar>
+              <w:top w:w="80" w:type="dxa"/>
+              <w:left w:w="100" w:type="dxa"/>
+              <w:bottom w:w="80" w:type="dxa"/>
+              <w:right w:w="100" w:type="dxa"/>
+            </w:tcMar>
+          </w:tcPr>
+          <w:p>
+            <w:r>
+              <w:rPr>
+                <w:sz w:val="20"/>
+                <w:szCs w:val="20"/>
+              </w:rPr>
+              <w:t>Android platform libraries</w:t>
+            </w:r>
+          </w:p>
+        </w:tc>
+      </w:tr>
+      <w:tr>
+        <w:tc>
+          <w:tcPr>
+            <w:tcW w:w="3000" w:type="dxa"/>
+            <w:tcBorders>
+              <w:top w:val="single" w:sz="1" w:space="0" w:color="000000"/>
+              <w:left w:val="single" w:sz="1" w:space="0" w:color="000000"/>
+              <w:bottom w:val="single" w:sz="1" w:space="0" w:color="000000"/>
+              <w:right w:val="single" w:sz="1" w:space="0" w:color="000000"/>
+            </w:tcBorders>
+            <w:tcMar>
+              <w:top w:w="80" w:type="dxa"/>
+              <w:left w:w="100" w:type="dxa"/>
+              <w:bottom w:w="80" w:type="dxa"/>
+              <w:right w:w="100" w:type="dxa"/>
+            </w:tcMar>
+          </w:tcPr>
+          <w:p>
+            <w:r>
+              <w:rPr>
+                <w:sz w:val="20"/>
+                <w:szCs w:val="20"/>
+              </w:rPr>
+              <w:t>Git</w:t>
+            </w:r>
+          </w:p>
+        </w:tc>
+        <w:tc>
+          <w:tcPr>
+            <w:tcW w:w="3000" w:type="dxa"/>
+            <w:tcBorders>
+              <w:top w:val="single" w:sz="1" w:space="0" w:color="000000"/>
+              <w:left w:val="single" w:sz="1" w:space="0" w:color="000000"/>
+              <w:bottom w:val="single" w:sz="1" w:space="0" w:color="000000"/>
+              <w:right w:val="single" w:sz="1" w:space="0" w:color="000000"/>
+            </w:tcBorders>
+            <w:tcMar>
+              <w:top w:w="80" w:type="dxa"/>
+              <w:left w:w="100" w:type="dxa"/>
+              <w:bottom w:w="80" w:type="dxa"/>
+              <w:right w:w="100" w:type="dxa"/>
+            </w:tcMar>
+          </w:tcPr>
+          <w:p>
+            <w:r>
+              <w:rPr>
+                <w:sz w:val="20"/>
+                <w:szCs w:val="20"/>
+              </w:rPr>
+              <w:t>Latest version</w:t>
+            </w:r>
+          </w:p>
+        </w:tc>
+        <w:tc>
+          <w:tcPr>
+            <w:tcW w:w="3360" w:type="dxa"/>
+            <w:tcBorders>
+              <w:top w:val="single" w:sz="1" w:space="0" w:color="000000"/>
+              <w:left w:val="single" w:sz="1" w:space="0" w:color="000000"/>
+              <w:bottom w:val="single" w:sz="1" w:space="0" w:color="000000"/>
+              <w:right w:val="single" w:sz="1" w:space="0" w:color="000000"/>
+            </w:tcBorders>
+            <w:tcMar>
+              <w:top w:w="80" w:type="dxa"/>
+              <w:left w:w="100" w:type="dxa"/>
+              <w:bottom w:w="80" w:type="dxa"/>
+              <w:right w:w="100" w:type="dxa"/>
+            </w:tcMar>
+          </w:tcPr>
+          <w:p>
+            <w:r>
+              <w:rPr>
+                <w:sz w:val="20"/>
+                <w:szCs w:val="20"/>
+              </w:rPr>
+              <w:t>Version control</w:t>
+            </w:r>
+          </w:p>
+        </w:tc>
+      </w:tr>
+      <w:tr>
+        <w:tc>
+          <w:tcPr>
+            <w:tcW w:w="3000" w:type="dxa"/>
+            <w:tcBorders>
+              <w:top w:val="single" w:sz="1" w:space="0" w:color="000000"/>
+              <w:left w:val="single" w:sz="1" w:space="0" w:color="000000"/>
+              <w:bottom w:val="single" w:sz="1" w:space="0" w:color="000000"/>
+              <w:right w:val="single" w:sz="1" w:space="0" w:color="000000"/>
+            </w:tcBorders>
+            <w:tcMar>
+              <w:top w:w="80" w:type="dxa"/>
+              <w:left w:w="100" w:type="dxa"/>
+              <w:bottom w:w="80" w:type="dxa"/>
+              <w:right w:w="100" w:type="dxa"/>
+            </w:tcMar>
+          </w:tcPr>
+          <w:p>
+            <w:r>
+              <w:rPr>
+                <w:sz w:val="20"/>
+                <w:szCs w:val="20"/>
+              </w:rPr>
+              <w:t>GitHub</w:t>
+            </w:r>
+          </w:p>
+        </w:tc>
+        <w:tc>
+          <w:tcPr>
+            <w:tcW w:w="3000" w:type="dxa"/>
+            <w:tcBorders>
+              <w:top w:val="single" w:sz="1" w:space="0" w:color="000000"/>
+              <w:left w:val="single" w:sz="1" w:space="0" w:color="000000"/>
+              <w:bottom w:val="single" w:sz="1" w:space="0" w:color="000000"/>
+              <w:right w:val="single" w:sz="1" w:space="0" w:color="000000"/>
+            </w:tcBorders>
+            <w:tcMar>
+              <w:top w:w="80" w:type="dxa"/>
+              <w:left w:w="100" w:type="dxa"/>
+              <w:bottom w:w="80" w:type="dxa"/>
+              <w:right w:w="100" w:type="dxa"/>
+            </w:tcMar>
+          </w:tcPr>
+          <w:p>
+            <w:r>
+              <w:rPr>
+                <w:sz w:val="20"/>
+                <w:szCs w:val="20"/>
+              </w:rPr>
+              <w:t>github.com</w:t>
+            </w:r>
+          </w:p>
+        </w:tc>
+        <w:tc>
+          <w:tcPr>
+            <w:tcW w:w="3360" w:type="dxa"/>
+            <w:tcBorders>
+              <w:top w:val="single" w:sz="1" w:space="0" w:color="000000"/>
+              <w:left w:val="single" w:sz="1" w:space="0" w:color="000000"/>
+              <w:bottom w:val="single" w:sz="1" w:space="0" w:color="000000"/>
+              <w:right w:val="single" w:sz="1" w:space="0" w:color="000000"/>
+            </w:tcBorders>
+            <w:tcMar>
+              <w:top w:w="80" w:type="dxa"/>
+              <w:left w:w="100" w:type="dxa"/>
+              <w:bottom w:w="80" w:type="dxa"/>
+              <w:right w:w="100" w:type="dxa"/>
+            </w:tcMar>
+          </w:tcPr>
+          <w:p>
+            <w:r>
+              <w:rPr>
+                <w:sz w:val="20"/>
+                <w:szCs w:val="20"/>
+              </w:rPr>
+              <w:t>Remote repository hosting</w:t>
+            </w:r>
+          </w:p>
+        </w:tc>
+      </w:tr>
+      <w:tr>
+        <w:tc>
+          <w:tcPr>
+            <w:tcW w:w="3000" w:type="dxa"/>
+            <w:tcBorders>
+              <w:top w:val="single" w:sz="1" w:space="0" w:color="000000"/>
+              <w:left w:val="single" w:sz="1" w:space="0" w:color="000000"/>
+              <w:bottom w:val="single" w:sz="1" w:space="0" w:color="000000"/>
+              <w:right w:val="single" w:sz="1" w:space="0" w:color="000000"/>
+            </w:tcBorders>
+            <w:tcMar>
+              <w:top w:w="80" w:type="dxa"/>
+              <w:left w:w="100" w:type="dxa"/>
+              <w:bottom w:w="80" w:type="dxa"/>
+              <w:right w:w="100" w:type="dxa"/>
+            </w:tcMar>
+          </w:tcPr>
+          <w:p>
+            <w:r>
+              <w:rPr>
+                <w:sz w:val="20"/>
+                <w:szCs w:val="20"/>
+              </w:rPr>
+              <w:t>Android Phone</w:t>
+            </w:r>
+          </w:p>
+        </w:tc>
+        <w:tc>
+          <w:tcPr>
+            <w:tcW w:w="3000" w:type="dxa"/>
+            <w:tcBorders>
+              <w:top w:val="single" w:sz="1" w:space="0" w:color="000000"/>
+              <w:left w:val="single" w:sz="1" w:space="0" w:color="000000"/>
+              <w:bottom w:val="single" w:sz="1" w:space="0" w:color="000000"/>
+              <w:right w:val="single" w:sz="1" w:space="0" w:color="000000"/>
+            </w:tcBorders>
+            <w:tcMar>
+              <w:top w:w="80" w:type="dxa"/>
+              <w:left w:w="100" w:type="dxa"/>
+              <w:bottom w:w="80" w:type="dxa"/>
+              <w:right w:w="100" w:type="dxa"/>
+            </w:tcMar>
+          </w:tcPr>
+          <w:p>
+            <w:r>
+              <w:rPr>
+                <w:sz w:val="20"/>
+                <w:szCs w:val="20"/>
+              </w:rPr>
+              <w:t>USB connected</w:t>
+            </w:r>
+          </w:p>
+        </w:tc>
+        <w:tc>
+          <w:tcPr>
+            <w:tcW w:w="3360" w:type="dxa"/>
+            <w:tcBorders>
+              <w:top w:val="single" w:sz="1" w:space="0" w:color="000000"/>
+              <w:left w:val="single" w:sz="1" w:space="0" w:color="000000"/>
+              <w:bottom w:val="single" w:sz="1" w:space="0" w:color="000000"/>
+              <w:right w:val="single" w:sz="1" w:space="0" w:color="000000"/>
+            </w:tcBorders>
+            <w:tcMar>
+              <w:top w:w="80" w:type="dxa"/>
+              <w:left w:w="100" w:type="dxa"/>
+              <w:bottom w:w="80" w:type="dxa"/>
+              <w:right w:w="100" w:type="dxa"/>
+            </w:tcMar>
+          </w:tcPr>
+          <w:p>
+            <w:r>
+              <w:rPr>
+                <w:sz w:val="20"/>
+                <w:szCs w:val="20"/>
+              </w:rPr>
+              <w:t>Real device for testing</w:t>
+            </w:r>
+          </w:p>
+        </w:tc>
+      </w:tr>
+    </w:tbl>
+    <w:p>
+      <w:pPr>
+        <w:spacing w:before="80" w:after="80"/>
+      </w:pPr>
+      <w:r>
+        <w:t xml:space="preserve"> </w:t>
+      </w:r>
+    </w:p>
+    <w:p>
+      <w:pPr>
+        <w:spacing w:before="200" w:after="100"/>
+      </w:pPr>
+      <w:r>
+        <w:rPr>
+          <w:b/>
+          <w:bCs/>
+          <w:sz w:val="24"/>
+          <w:szCs w:val="24"/>
+        </w:rPr>
+        <w:t>Personal Reflection</w:t>
+      </w:r>
+    </w:p>
+    <w:p>
+      <w:r>
+        <w:t>Setting up Android Studio was straightforward. The most challenging part was configuring the Android SDK and ensuring the emulator ran without performance issues. I learned the difference between native and cross-platform development approaches. SpareDash will be built natively for Android using Kotlin for best performance.</w:t>
+      </w:r>
+      <w:r>
+        <w:br w:type="page"/>
+      </w:r>
+    </w:p>
+    <w:p>
+      <w:pPr>
+        <w:spacing w:before="320" w:after="160"/>
+      </w:pPr>
+      <w:r>
+        <w:rPr>
+          <w:b/>
+          <w:bCs/>
+          <w:sz w:val="26"/>
+          <w:szCs w:val="26"/>
+        </w:rPr>
+        <w:lastRenderedPageBreak/>
+        <w:t>WEEK 2: Mobile Development Environment</w:t>
+      </w:r>
+    </w:p>
+    <w:p>
+      <w:pPr>
+        <w:spacing w:before="80" w:after="80"/>
+      </w:pPr>
+      <w:r>
+        <w:t xml:space="preserve"> </w:t>
+      </w:r>
+    </w:p>
+    <w:p>
+      <w:pPr>
+        <w:spacing w:before="200" w:after="100"/>
+      </w:pPr>
+      <w:r>
+        <w:rPr>
+          <w:b/>
+          <w:bCs/>
+          <w:sz w:val="24"/>
+          <w:szCs w:val="24"/>
+        </w:rPr>
+        <w:t>Practical Activities Undertaken</w:t>
+      </w:r>
+    </w:p>
+    <w:p>
+      <w:pPr>
+        <w:pStyle w:val="ListParagraph"/>
+        <w:numPr>
+          <w:ilvl w:val="0"/>
+          <w:numId w:val="2"/>
+        </w:numPr>
+        <w:spacing w:before="40" w:after="40"/>
+      </w:pPr>
+      <w:r>
+        <w:t xml:space="preserve">Created new Android project: Name = SpareDash, Package = </w:t>
+      </w:r>
+      <w:proofErr w:type="spellStart"/>
+      <w:r>
+        <w:t>com.sparedash.app</w:t>
+      </w:r>
+      <w:proofErr w:type="spellEnd"/>
+      <w:r>
+        <w:t>, Language = Kotlin, Min SDK = API 24.</w:t>
+      </w:r>
+    </w:p>
+    <w:p>
+      <w:pPr>
+        <w:pStyle w:val="ListParagraph"/>
+        <w:numPr>
+          <w:ilvl w:val="0"/>
+          <w:numId w:val="2"/>
+        </w:numPr>
+        <w:spacing w:before="40" w:after="40"/>
+      </w:pPr>
+      <w:r>
+        <w:t>Confirmed Gradle sync completed successfully.</w:t>
+      </w:r>
+    </w:p>
+    <w:p>
+      <w:pPr>
+        <w:pStyle w:val="ListParagraph"/>
+        <w:numPr>
+          <w:ilvl w:val="0"/>
+          <w:numId w:val="2"/>
+        </w:numPr>
+        <w:spacing w:before="40" w:after="40"/>
+      </w:pPr>
+      <w:r>
+        <w:t>Explored the generated project folder structure: java/, res/layout/, res/values/, AndroidManifest.xml.</w:t>
+      </w:r>
+    </w:p>
+    <w:p>
+      <w:pPr>
+        <w:pStyle w:val="ListParagraph"/>
+        <w:numPr>
+          <w:ilvl w:val="0"/>
+          <w:numId w:val="2"/>
+        </w:numPr>
+        <w:spacing w:before="40" w:after="40"/>
+      </w:pPr>
+      <w:r>
+        <w:t>Added all required Gradle dependencies: Room, Navigation Component, ViewModel, LiveData, Glide, Coroutines, Material Design.</w:t>
+      </w:r>
+    </w:p>
+    <w:p>
+      <w:pPr>
+        <w:pStyle w:val="ListParagraph"/>
+        <w:numPr>
+          <w:ilvl w:val="0"/>
+          <w:numId w:val="2"/>
+        </w:numPr>
+        <w:spacing w:before="40" w:after="40"/>
+      </w:pPr>
+      <w:r>
+        <w:t xml:space="preserve">Created package folders: data/, ui/, viewmodel/, utils/ inside </w:t>
+      </w:r>
+      <w:proofErr w:type="spellStart"/>
+      <w:r>
+        <w:t>com.sparedash.app</w:t>
+      </w:r>
+      <w:proofErr w:type="spellEnd"/>
+      <w:r>
+        <w:t>.</w:t>
+      </w:r>
+    </w:p>
+    <w:p>
+      <w:pPr>
+        <w:pStyle w:val="ListParagraph"/>
+        <w:numPr>
+          <w:ilvl w:val="0"/>
+          <w:numId w:val="2"/>
+        </w:numPr>
+        <w:spacing w:before="40" w:after="40"/>
+      </w:pPr>
+      <w:r>
+        <w:t xml:space="preserve">Defined app </w:t>
+      </w:r>
+      <w:proofErr w:type="spellStart"/>
+      <w:r>
+        <w:t>colour</w:t>
+      </w:r>
+      <w:proofErr w:type="spellEnd"/>
+      <w:r>
+        <w:t xml:space="preserve"> scheme in res/values/colors.xml.</w:t>
+      </w:r>
+    </w:p>
+    <w:p>
+      <w:pPr>
+        <w:pStyle w:val="ListParagraph"/>
+        <w:numPr>
+          <w:ilvl w:val="0"/>
+          <w:numId w:val="2"/>
+        </w:numPr>
+        <w:spacing w:before="40" w:after="40"/>
+      </w:pPr>
+      <w:r>
+        <w:t>Configured AndroidManifest.xml: app name, theme, INTERNET permission.</w:t>
+      </w:r>
+    </w:p>
+    <w:p>
+      <w:pPr>
+        <w:pStyle w:val="ListParagraph"/>
+        <w:numPr>
+          <w:ilvl w:val="0"/>
+          <w:numId w:val="2"/>
+        </w:numPr>
+        <w:spacing w:before="40" w:after="40"/>
+      </w:pPr>
+      <w:r>
+        <w:t>Ran the default Hello World app on the connected Android phone via USB.</w:t>
+      </w:r>
+    </w:p>
+    <w:p>
+      <w:pPr>
+        <w:pStyle w:val="ListParagraph"/>
+        <w:numPr>
+          <w:ilvl w:val="0"/>
+          <w:numId w:val="2"/>
+        </w:numPr>
+        <w:spacing w:before="40" w:after="40"/>
+      </w:pPr>
+      <w:r>
+        <w:t>Made first GitHub commit: "Initial commit: SpareDash project setup".</w:t>
+      </w:r>
+    </w:p>
+    <w:p>
+      <w:pPr>
+        <w:spacing w:before="80" w:after="80"/>
+      </w:pPr>
+      <w:r>
+        <w:t xml:space="preserve"> </w:t>
+      </w:r>
+    </w:p>
+    <w:p>
+      <w:pPr>
+        <w:spacing w:before="200" w:after="100"/>
+      </w:pPr>
+      <w:r>
+        <w:rPr>
+          <w:b/>
+          <w:bCs/>
+          <w:sz w:val="24"/>
+          <w:szCs w:val="24"/>
+        </w:rPr>
+        <w:t>Screenshots / Evidence</w:t>
+      </w:r>
+    </w:p>
+    <w:p>
+      <w:pPr>
+        <w:spacing w:before="60" w:after="60"/>
+      </w:pPr>
+      <w:r>
+        <w:t xml:space="preserve">Screenshots Attached: Yes / </w:t>
+      </w:r>
+      <w:proofErr w:type="gramStart"/>
+      <w:r>
+        <w:t>No  (</w:t>
+      </w:r>
+      <w:proofErr w:type="gramEnd"/>
+      <w:r>
+        <w:t>circle one)</w:t>
+      </w:r>
+    </w:p>
+    <w:p>
+      <w:pPr>
+        <w:spacing w:before="80" w:after="80"/>
+      </w:pPr>
+      <w:r>
+        <w:t xml:space="preserve"> </w:t>
+      </w:r>
+    </w:p>
     <w:tbl>
       <w:tblPr>
         <w:tblW w:w="9360" w:type="dxa"/>
@@ -2434,6 +2309,126 @@
                 <w:sz w:val="20"/>
                 <w:szCs w:val="20"/>
               </w:rPr>
+              <w:t>Screenshot: SpareDash project open in Android Studio showing folder structure</w:t>
+            </w:r>
+          </w:p>
+          <w:p>
+            <w:pPr>
+              <w:jc w:val="center"/>
+            </w:pPr>
+            <w:r>
+              <w:rPr>
+                <w:noProof/>
+              </w:rPr>
+              <w:drawing>
+                <wp:inline distT="0" distB="0" distL="0" distR="0" wp14:anchorId="5EE09BEC" wp14:editId="2557D366">
+                  <wp:extent cx="5943600" cy="3157855"/>
+                  <wp:effectExtent l="0" t="0" r="0" b="4445"/>
+                  <wp:docPr id="1664994744" name="Picture 5"/>
+                  <wp:cNvGraphicFramePr>
+                    <a:graphicFrameLocks xmlns:a="http://schemas.openxmlformats.org/drawingml/2006/main" noChangeAspect="1"/>
+                  </wp:cNvGraphicFramePr>
+                  <a:graphic xmlns:a="http://schemas.openxmlformats.org/drawingml/2006/main">
+                    <a:graphicData uri="http://schemas.openxmlformats.org/drawingml/2006/picture">
+                      <pic:pic xmlns:pic="http://schemas.openxmlformats.org/drawingml/2006/picture">
+                        <pic:nvPicPr>
+                          <pic:cNvPr id="0" name="Picture 9"/>
+                          <pic:cNvPicPr>
+                            <a:picLocks noChangeAspect="1" noChangeArrowheads="1"/>
+                          </pic:cNvPicPr>
+                        </pic:nvPicPr>
+                        <pic:blipFill>
+                          <a:blip r:embed="rId10" cstate="print">
+                            <a:extLst>
+                              <a:ext uri="{28A0092B-C50C-407E-A947-70E740481C1C}">
+                                <a14:useLocalDpi xmlns:a14="http://schemas.microsoft.com/office/drawing/2010/main" val="0"/>
+                              </a:ext>
+                            </a:extLst>
+                          </a:blip>
+                          <a:srcRect/>
+                          <a:stretch>
+                            <a:fillRect/>
+                          </a:stretch>
+                        </pic:blipFill>
+                        <pic:spPr bwMode="auto">
+                          <a:xfrm>
+                            <a:off x="0" y="0"/>
+                            <a:ext cx="5943600" cy="3157855"/>
+                          </a:xfrm>
+                          <a:prstGeom prst="rect">
+                            <a:avLst/>
+                          </a:prstGeom>
+                          <a:noFill/>
+                          <a:ln>
+                            <a:noFill/>
+                          </a:ln>
+                        </pic:spPr>
+                      </pic:pic>
+                    </a:graphicData>
+                  </a:graphic>
+                </wp:inline>
+              </w:drawing>
+            </w:r>
+          </w:p>
+        </w:tc>
+      </w:tr>
+    </w:tbl>
+    <w:p>
+      <w:pPr>
+        <w:spacing w:before="80" w:after="80"/>
+      </w:pPr>
+      <w:r>
+        <w:t xml:space="preserve"> </w:t>
+      </w:r>
+    </w:p>
+    <w:tbl>
+      <w:tblPr>
+        <w:tblW w:w="9360" w:type="dxa"/>
+        <w:tblBorders>
+          <w:top w:val="single" w:sz="4" w:space="0" w:color="auto"/>
+          <w:left w:val="single" w:sz="4" w:space="0" w:color="auto"/>
+          <w:bottom w:val="single" w:sz="4" w:space="0" w:color="auto"/>
+          <w:right w:val="single" w:sz="4" w:space="0" w:color="auto"/>
+          <w:insideH w:val="single" w:sz="4" w:space="0" w:color="auto"/>
+          <w:insideV w:val="single" w:sz="4" w:space="0" w:color="auto"/>
+        </w:tblBorders>
+        <w:tblCellMar>
+          <w:left w:w="10" w:type="dxa"/>
+          <w:right w:w="10" w:type="dxa"/>
+        </w:tblCellMar>
+        <w:tblLook w:val="04A0" w:firstRow="1" w:lastRow="0" w:firstColumn="1" w:lastColumn="0" w:noHBand="0" w:noVBand="1"/>
+      </w:tblPr>
+      <w:tblGrid>
+        <w:gridCol w:w="9760"/>
+      </w:tblGrid>
+      <w:tr>
+        <w:tc>
+          <w:tcPr>
+            <w:tcW w:w="0" w:type="auto"/>
+            <w:tcBorders>
+              <w:top w:val="dashed" w:sz="2" w:space="0" w:color="000000"/>
+              <w:left w:val="dashed" w:sz="2" w:space="0" w:color="000000"/>
+              <w:bottom w:val="dashed" w:sz="2" w:space="0" w:color="000000"/>
+              <w:right w:val="dashed" w:sz="2" w:space="0" w:color="000000"/>
+            </w:tcBorders>
+            <w:tcMar>
+              <w:top w:w="300" w:type="dxa"/>
+              <w:left w:w="200" w:type="dxa"/>
+              <w:bottom w:w="300" w:type="dxa"/>
+              <w:right w:w="200" w:type="dxa"/>
+            </w:tcMar>
+          </w:tcPr>
+          <w:p>
+            <w:pPr>
+              <w:jc w:val="center"/>
+            </w:pPr>
+            <w:r>
+              <w:rPr>
+                <w:b/>
+                <w:bCs/>
+                <w:sz w:val="20"/>
+                <w:szCs w:val="20"/>
+              </w:rPr>
               <w:lastRenderedPageBreak/>
               <w:t>Screenshot: build.gradle.kts showing all dependencies added</w:t>
             </w:r>
@@ -2464,7 +2459,7 @@
                           </pic:cNvPicPr>
                         </pic:nvPicPr>
                         <pic:blipFill>
-                          <a:blip r:embed="rId10" cstate="print">
+                          <a:blip r:embed="rId11" cstate="print">
                             <a:extLst>
                               <a:ext uri="{28A0092B-C50C-407E-A947-70E740481C1C}">
                                 <a14:useLocalDpi xmlns:a14="http://schemas.microsoft.com/office/drawing/2010/main" val="0"/>
@@ -2585,7 +2580,7 @@
                           </pic:cNvPicPr>
                         </pic:nvPicPr>
                         <pic:blipFill>
-                          <a:blip r:embed="rId11">
+                          <a:blip r:embed="rId12">
                             <a:extLst>
                               <a:ext uri="{28A0092B-C50C-407E-A947-70E740481C1C}">
                                 <a14:useLocalDpi xmlns:a14="http://schemas.microsoft.com/office/drawing/2010/main" val="0"/>
@@ -2647,7 +2642,7 @@
         <w:tblLook w:val="04A0" w:firstRow="1" w:lastRow="0" w:firstColumn="1" w:lastColumn="0" w:noHBand="0" w:noVBand="1"/>
       </w:tblPr>
       <w:tblGrid>
-        <w:gridCol w:w="9360"/>
+        <w:gridCol w:w="9760"/>
       </w:tblGrid>
       <w:tr>
         <w:tc>
@@ -2686,12 +2681,56 @@
             </w:pPr>
             <w:r>
               <w:rPr>
-                <w:i/>
-                <w:iCs/>
-                <w:sz w:val="20"/>
-                <w:szCs w:val="20"/>
-              </w:rPr>
-              <w:t>[Paste your screenshot here]</w:t>
+                <w:noProof/>
+              </w:rPr>
+              <w:drawing>
+                <wp:inline distT="0" distB="0" distL="0" distR="0" wp14:anchorId="772DFD8B" wp14:editId="39F39544">
+                  <wp:extent cx="5943600" cy="3157855"/>
+                  <wp:effectExtent l="0" t="0" r="0" b="4445"/>
+                  <wp:docPr id="711068708" name="Picture 5"/>
+                  <wp:cNvGraphicFramePr>
+                    <a:graphicFrameLocks xmlns:a="http://schemas.openxmlformats.org/drawingml/2006/main" noChangeAspect="1"/>
+                  </wp:cNvGraphicFramePr>
+                  <a:graphic xmlns:a="http://schemas.openxmlformats.org/drawingml/2006/main">
+                    <a:graphicData uri="http://schemas.openxmlformats.org/drawingml/2006/picture">
+                      <pic:pic xmlns:pic="http://schemas.openxmlformats.org/drawingml/2006/picture">
+                        <pic:nvPicPr>
+                          <pic:cNvPr id="0" name="Picture 21"/>
+                          <pic:cNvPicPr>
+                            <a:picLocks noChangeAspect="1" noChangeArrowheads="1"/>
+                          </pic:cNvPicPr>
+                        </pic:nvPicPr>
+                        <pic:blipFill>
+                          <a:blip r:embed="rId13" cstate="print">
+                            <a:extLst>
+                              <a:ext uri="{28A0092B-C50C-407E-A947-70E740481C1C}">
+                                <a14:useLocalDpi xmlns:a14="http://schemas.microsoft.com/office/drawing/2010/main" val="0"/>
+                              </a:ext>
+                            </a:extLst>
+                          </a:blip>
+                          <a:srcRect/>
+                          <a:stretch>
+                            <a:fillRect/>
+                          </a:stretch>
+                        </pic:blipFill>
+                        <pic:spPr bwMode="auto">
+                          <a:xfrm>
+                            <a:off x="0" y="0"/>
+                            <a:ext cx="5943600" cy="3157855"/>
+                          </a:xfrm>
+                          <a:prstGeom prst="rect">
+                            <a:avLst/>
+                          </a:prstGeom>
+                          <a:noFill/>
+                          <a:ln>
+                            <a:noFill/>
+                          </a:ln>
+                        </pic:spPr>
+                      </pic:pic>
+                    </a:graphicData>
+                  </a:graphic>
+                </wp:inline>
+              </w:drawing>
             </w:r>
           </w:p>
         </w:tc>
@@ -3346,7 +3385,14 @@
         <w:spacing w:before="60" w:after="60"/>
       </w:pPr>
       <w:r>
-        <w:t>(Not more than 50 words)</w:t>
+        <w:rPr>
+          <w:sz w:val="24"/>
+          <w:szCs w:val="24"/>
+        </w:rPr>
+        <w:t>Adding all Gradle dependencies and syncing successfully gave me confidence. I struggled initially with Kotlin syntax compared to Java but practiced data classes and lambdas. Setting up the GitHub repository means my progress is tracked professionally. The emulator runs smoothly</w:t>
+      </w:r>
+      <w:r>
+        <w:t>.</w:t>
       </w:r>
     </w:p>
     <w:p>
@@ -3357,47 +3403,6 @@
         <w:t xml:space="preserve"> </w:t>
       </w:r>
     </w:p>
-    <w:tbl>
-      <w:tblPr>
-        <w:tblW w:w="9360" w:type="dxa"/>
-        <w:tblBorders>
-          <w:top w:val="single" w:sz="4" w:space="0" w:color="auto"/>
-          <w:left w:val="single" w:sz="4" w:space="0" w:color="auto"/>
-          <w:bottom w:val="single" w:sz="4" w:space="0" w:color="auto"/>
-          <w:right w:val="single" w:sz="4" w:space="0" w:color="auto"/>
-          <w:insideH w:val="single" w:sz="4" w:space="0" w:color="auto"/>
-          <w:insideV w:val="single" w:sz="4" w:space="0" w:color="auto"/>
-        </w:tblBorders>
-        <w:tblCellMar>
-          <w:left w:w="10" w:type="dxa"/>
-          <w:right w:w="10" w:type="dxa"/>
-        </w:tblCellMar>
-        <w:tblLook w:val="04A0" w:firstRow="1" w:lastRow="0" w:firstColumn="1" w:lastColumn="0" w:noHBand="0" w:noVBand="1"/>
-      </w:tblPr>
-      <w:tblGrid>
-        <w:gridCol w:w="9360"/>
-      </w:tblGrid>
-      <w:tr>
-        <w:tc>
-          <w:tcPr>
-            <w:tcW w:w="0" w:type="auto"/>
-            <w:tcBorders>
-              <w:top w:val="single" w:sz="1" w:space="0" w:color="000000"/>
-              <w:left w:val="single" w:sz="1" w:space="0" w:color="000000"/>
-              <w:bottom w:val="single" w:sz="1" w:space="0" w:color="000000"/>
-              <w:right w:val="single" w:sz="1" w:space="0" w:color="000000"/>
-            </w:tcBorders>
-            <w:tcMar>
-              <w:top w:w="120" w:type="dxa"/>
-              <w:left w:w="160" w:type="dxa"/>
-              <w:bottom w:w="600" w:type="dxa"/>
-              <w:right w:w="160" w:type="dxa"/>
-            </w:tcMar>
-          </w:tcPr>
-          <w:p/>
-        </w:tc>
-      </w:tr>
-    </w:tbl>
     <w:p>
       <w:r>
         <w:br w:type="page"/>
@@ -3709,7 +3714,7 @@
                           <pic:cNvPicPr/>
                         </pic:nvPicPr>
                         <pic:blipFill>
-                          <a:blip r:embed="rId12"/>
+                          <a:blip r:embed="rId14"/>
                           <a:stretch>
                             <a:fillRect/>
                           </a:stretch>
@@ -3826,253 +3831,6 @@
                       <pic:pic xmlns:pic="http://schemas.openxmlformats.org/drawingml/2006/picture">
                         <pic:nvPicPr>
                           <pic:cNvPr id="0" name="Picture 15"/>
-                          <pic:cNvPicPr>
-                            <a:picLocks noChangeAspect="1" noChangeArrowheads="1"/>
-                          </pic:cNvPicPr>
-                        </pic:nvPicPr>
-                        <pic:blipFill>
-                          <a:blip r:embed="rId13" cstate="print">
-                            <a:extLst>
-                              <a:ext uri="{28A0092B-C50C-407E-A947-70E740481C1C}">
-                                <a14:useLocalDpi xmlns:a14="http://schemas.microsoft.com/office/drawing/2010/main" val="0"/>
-                              </a:ext>
-                            </a:extLst>
-                          </a:blip>
-                          <a:srcRect/>
-                          <a:stretch>
-                            <a:fillRect/>
-                          </a:stretch>
-                        </pic:blipFill>
-                        <pic:spPr bwMode="auto">
-                          <a:xfrm>
-                            <a:off x="0" y="0"/>
-                            <a:ext cx="5943600" cy="3343275"/>
-                          </a:xfrm>
-                          <a:prstGeom prst="rect">
-                            <a:avLst/>
-                          </a:prstGeom>
-                          <a:noFill/>
-                          <a:ln>
-                            <a:noFill/>
-                          </a:ln>
-                        </pic:spPr>
-                      </pic:pic>
-                    </a:graphicData>
-                  </a:graphic>
-                </wp:inline>
-              </w:drawing>
-            </w:r>
-          </w:p>
-          <w:p>
-            <w:pPr>
-              <w:jc w:val="center"/>
-            </w:pPr>
-          </w:p>
-        </w:tc>
-      </w:tr>
-    </w:tbl>
-    <w:p>
-      <w:pPr>
-        <w:spacing w:before="80" w:after="80"/>
-      </w:pPr>
-      <w:r>
-        <w:lastRenderedPageBreak/>
-        <w:t xml:space="preserve"> </w:t>
-      </w:r>
-    </w:p>
-    <w:tbl>
-      <w:tblPr>
-        <w:tblW w:w="9360" w:type="dxa"/>
-        <w:tblBorders>
-          <w:top w:val="single" w:sz="4" w:space="0" w:color="auto"/>
-          <w:left w:val="single" w:sz="4" w:space="0" w:color="auto"/>
-          <w:bottom w:val="single" w:sz="4" w:space="0" w:color="auto"/>
-          <w:right w:val="single" w:sz="4" w:space="0" w:color="auto"/>
-          <w:insideH w:val="single" w:sz="4" w:space="0" w:color="auto"/>
-          <w:insideV w:val="single" w:sz="4" w:space="0" w:color="auto"/>
-        </w:tblBorders>
-        <w:tblCellMar>
-          <w:left w:w="10" w:type="dxa"/>
-          <w:right w:w="10" w:type="dxa"/>
-        </w:tblCellMar>
-        <w:tblLook w:val="04A0" w:firstRow="1" w:lastRow="0" w:firstColumn="1" w:lastColumn="0" w:noHBand="0" w:noVBand="1"/>
-      </w:tblPr>
-      <w:tblGrid>
-        <w:gridCol w:w="9760"/>
-      </w:tblGrid>
-      <w:tr>
-        <w:tc>
-          <w:tcPr>
-            <w:tcW w:w="0" w:type="auto"/>
-            <w:tcBorders>
-              <w:top w:val="dashed" w:sz="2" w:space="0" w:color="000000"/>
-              <w:left w:val="dashed" w:sz="2" w:space="0" w:color="000000"/>
-              <w:bottom w:val="dashed" w:sz="2" w:space="0" w:color="000000"/>
-              <w:right w:val="dashed" w:sz="2" w:space="0" w:color="000000"/>
-            </w:tcBorders>
-            <w:tcMar>
-              <w:top w:w="300" w:type="dxa"/>
-              <w:left w:w="200" w:type="dxa"/>
-              <w:bottom w:w="300" w:type="dxa"/>
-              <w:right w:w="200" w:type="dxa"/>
-            </w:tcMar>
-          </w:tcPr>
-          <w:p>
-            <w:pPr>
-              <w:jc w:val="center"/>
-            </w:pPr>
-            <w:r>
-              <w:rPr>
-                <w:b/>
-                <w:bCs/>
-                <w:sz w:val="20"/>
-                <w:szCs w:val="20"/>
-              </w:rPr>
-              <w:t>Screenshot: activity_login.xml open in Android Studio Layout Editor</w:t>
-            </w:r>
-          </w:p>
-          <w:p>
-            <w:pPr>
-              <w:jc w:val="center"/>
-            </w:pPr>
-            <w:r>
-              <w:rPr>
-                <w:noProof/>
-              </w:rPr>
-              <w:drawing>
-                <wp:inline distT="0" distB="0" distL="0" distR="0" wp14:anchorId="4913A038" wp14:editId="039AD1D4">
-                  <wp:extent cx="5943600" cy="3343275"/>
-                  <wp:effectExtent l="0" t="0" r="0" b="9525"/>
-                  <wp:docPr id="1206575446" name="Picture 9"/>
-                  <wp:cNvGraphicFramePr>
-                    <a:graphicFrameLocks xmlns:a="http://schemas.openxmlformats.org/drawingml/2006/main" noChangeAspect="1"/>
-                  </wp:cNvGraphicFramePr>
-                  <a:graphic xmlns:a="http://schemas.openxmlformats.org/drawingml/2006/main">
-                    <a:graphicData uri="http://schemas.openxmlformats.org/drawingml/2006/picture">
-                      <pic:pic xmlns:pic="http://schemas.openxmlformats.org/drawingml/2006/picture">
-                        <pic:nvPicPr>
-                          <pic:cNvPr id="0" name="Picture 17"/>
-                          <pic:cNvPicPr>
-                            <a:picLocks noChangeAspect="1" noChangeArrowheads="1"/>
-                          </pic:cNvPicPr>
-                        </pic:nvPicPr>
-                        <pic:blipFill>
-                          <a:blip r:embed="rId14" cstate="print">
-                            <a:extLst>
-                              <a:ext uri="{28A0092B-C50C-407E-A947-70E740481C1C}">
-                                <a14:useLocalDpi xmlns:a14="http://schemas.microsoft.com/office/drawing/2010/main" val="0"/>
-                              </a:ext>
-                            </a:extLst>
-                          </a:blip>
-                          <a:srcRect/>
-                          <a:stretch>
-                            <a:fillRect/>
-                          </a:stretch>
-                        </pic:blipFill>
-                        <pic:spPr bwMode="auto">
-                          <a:xfrm>
-                            <a:off x="0" y="0"/>
-                            <a:ext cx="5943600" cy="3343275"/>
-                          </a:xfrm>
-                          <a:prstGeom prst="rect">
-                            <a:avLst/>
-                          </a:prstGeom>
-                          <a:noFill/>
-                          <a:ln>
-                            <a:noFill/>
-                          </a:ln>
-                        </pic:spPr>
-                      </pic:pic>
-                    </a:graphicData>
-                  </a:graphic>
-                </wp:inline>
-              </w:drawing>
-            </w:r>
-          </w:p>
-        </w:tc>
-      </w:tr>
-    </w:tbl>
-    <w:p>
-      <w:pPr>
-        <w:spacing w:before="80" w:after="80"/>
-      </w:pPr>
-      <w:r>
-        <w:lastRenderedPageBreak/>
-        <w:t xml:space="preserve"> </w:t>
-      </w:r>
-    </w:p>
-    <w:tbl>
-      <w:tblPr>
-        <w:tblW w:w="9360" w:type="dxa"/>
-        <w:tblBorders>
-          <w:top w:val="single" w:sz="4" w:space="0" w:color="auto"/>
-          <w:left w:val="single" w:sz="4" w:space="0" w:color="auto"/>
-          <w:bottom w:val="single" w:sz="4" w:space="0" w:color="auto"/>
-          <w:right w:val="single" w:sz="4" w:space="0" w:color="auto"/>
-          <w:insideH w:val="single" w:sz="4" w:space="0" w:color="auto"/>
-          <w:insideV w:val="single" w:sz="4" w:space="0" w:color="auto"/>
-        </w:tblBorders>
-        <w:tblCellMar>
-          <w:left w:w="10" w:type="dxa"/>
-          <w:right w:w="10" w:type="dxa"/>
-        </w:tblCellMar>
-        <w:tblLook w:val="04A0" w:firstRow="1" w:lastRow="0" w:firstColumn="1" w:lastColumn="0" w:noHBand="0" w:noVBand="1"/>
-      </w:tblPr>
-      <w:tblGrid>
-        <w:gridCol w:w="9760"/>
-      </w:tblGrid>
-      <w:tr>
-        <w:tc>
-          <w:tcPr>
-            <w:tcW w:w="0" w:type="auto"/>
-            <w:tcBorders>
-              <w:top w:val="dashed" w:sz="2" w:space="0" w:color="000000"/>
-              <w:left w:val="dashed" w:sz="2" w:space="0" w:color="000000"/>
-              <w:bottom w:val="dashed" w:sz="2" w:space="0" w:color="000000"/>
-              <w:right w:val="dashed" w:sz="2" w:space="0" w:color="000000"/>
-            </w:tcBorders>
-            <w:tcMar>
-              <w:top w:w="300" w:type="dxa"/>
-              <w:left w:w="200" w:type="dxa"/>
-              <w:bottom w:w="300" w:type="dxa"/>
-              <w:right w:w="200" w:type="dxa"/>
-            </w:tcMar>
-          </w:tcPr>
-          <w:p>
-            <w:pPr>
-              <w:jc w:val="center"/>
-            </w:pPr>
-            <w:r>
-              <w:rPr>
-                <w:b/>
-                <w:bCs/>
-                <w:sz w:val="20"/>
-                <w:szCs w:val="20"/>
-              </w:rPr>
-              <w:t>Screenshot: Splash Screen displayed on real Android phone</w:t>
-            </w:r>
-          </w:p>
-          <w:p>
-            <w:pPr>
-              <w:jc w:val="center"/>
-            </w:pPr>
-            <w:r>
-              <w:rPr>
-                <w:noProof/>
-              </w:rPr>
-              <w:drawing>
-                <wp:inline distT="0" distB="0" distL="0" distR="0" wp14:anchorId="461FFB81" wp14:editId="44A185E7">
-                  <wp:extent cx="5943600" cy="3343275"/>
-                  <wp:effectExtent l="0" t="0" r="0" b="9525"/>
-                  <wp:docPr id="53298886" name="Picture 13"/>
-                  <wp:cNvGraphicFramePr>
-                    <a:graphicFrameLocks xmlns:a="http://schemas.openxmlformats.org/drawingml/2006/main" noChangeAspect="1"/>
-                  </wp:cNvGraphicFramePr>
-                  <a:graphic xmlns:a="http://schemas.openxmlformats.org/drawingml/2006/main">
-                    <a:graphicData uri="http://schemas.openxmlformats.org/drawingml/2006/picture">
-                      <pic:pic xmlns:pic="http://schemas.openxmlformats.org/drawingml/2006/picture">
-                        <pic:nvPicPr>
-                          <pic:cNvPr id="0" name="Picture 34"/>
                           <pic:cNvPicPr>
                             <a:picLocks noChangeAspect="1" noChangeArrowheads="1"/>
                           </pic:cNvPicPr>
@@ -4110,6 +3868,252 @@
               </w:drawing>
             </w:r>
           </w:p>
+          <w:p>
+            <w:pPr>
+              <w:jc w:val="center"/>
+            </w:pPr>
+          </w:p>
+        </w:tc>
+      </w:tr>
+    </w:tbl>
+    <w:p>
+      <w:pPr>
+        <w:spacing w:before="80" w:after="80"/>
+      </w:pPr>
+      <w:r>
+        <w:t xml:space="preserve"> </w:t>
+      </w:r>
+    </w:p>
+    <w:tbl>
+      <w:tblPr>
+        <w:tblW w:w="9360" w:type="dxa"/>
+        <w:tblBorders>
+          <w:top w:val="single" w:sz="4" w:space="0" w:color="auto"/>
+          <w:left w:val="single" w:sz="4" w:space="0" w:color="auto"/>
+          <w:bottom w:val="single" w:sz="4" w:space="0" w:color="auto"/>
+          <w:right w:val="single" w:sz="4" w:space="0" w:color="auto"/>
+          <w:insideH w:val="single" w:sz="4" w:space="0" w:color="auto"/>
+          <w:insideV w:val="single" w:sz="4" w:space="0" w:color="auto"/>
+        </w:tblBorders>
+        <w:tblCellMar>
+          <w:left w:w="10" w:type="dxa"/>
+          <w:right w:w="10" w:type="dxa"/>
+        </w:tblCellMar>
+        <w:tblLook w:val="04A0" w:firstRow="1" w:lastRow="0" w:firstColumn="1" w:lastColumn="0" w:noHBand="0" w:noVBand="1"/>
+      </w:tblPr>
+      <w:tblGrid>
+        <w:gridCol w:w="9760"/>
+      </w:tblGrid>
+      <w:tr>
+        <w:tc>
+          <w:tcPr>
+            <w:tcW w:w="0" w:type="auto"/>
+            <w:tcBorders>
+              <w:top w:val="dashed" w:sz="2" w:space="0" w:color="000000"/>
+              <w:left w:val="dashed" w:sz="2" w:space="0" w:color="000000"/>
+              <w:bottom w:val="dashed" w:sz="2" w:space="0" w:color="000000"/>
+              <w:right w:val="dashed" w:sz="2" w:space="0" w:color="000000"/>
+            </w:tcBorders>
+            <w:tcMar>
+              <w:top w:w="300" w:type="dxa"/>
+              <w:left w:w="200" w:type="dxa"/>
+              <w:bottom w:w="300" w:type="dxa"/>
+              <w:right w:w="200" w:type="dxa"/>
+            </w:tcMar>
+          </w:tcPr>
+          <w:p>
+            <w:pPr>
+              <w:jc w:val="center"/>
+            </w:pPr>
+            <w:r>
+              <w:rPr>
+                <w:b/>
+                <w:bCs/>
+                <w:sz w:val="20"/>
+                <w:szCs w:val="20"/>
+              </w:rPr>
+              <w:t>Screenshot: activity_login.xml open in Android Studio Layout Editor</w:t>
+            </w:r>
+          </w:p>
+          <w:p>
+            <w:pPr>
+              <w:jc w:val="center"/>
+            </w:pPr>
+            <w:r>
+              <w:rPr>
+                <w:noProof/>
+              </w:rPr>
+              <w:drawing>
+                <wp:inline distT="0" distB="0" distL="0" distR="0" wp14:anchorId="4913A038" wp14:editId="039AD1D4">
+                  <wp:extent cx="5943600" cy="3343275"/>
+                  <wp:effectExtent l="0" t="0" r="0" b="9525"/>
+                  <wp:docPr id="1206575446" name="Picture 9"/>
+                  <wp:cNvGraphicFramePr>
+                    <a:graphicFrameLocks xmlns:a="http://schemas.openxmlformats.org/drawingml/2006/main" noChangeAspect="1"/>
+                  </wp:cNvGraphicFramePr>
+                  <a:graphic xmlns:a="http://schemas.openxmlformats.org/drawingml/2006/main">
+                    <a:graphicData uri="http://schemas.openxmlformats.org/drawingml/2006/picture">
+                      <pic:pic xmlns:pic="http://schemas.openxmlformats.org/drawingml/2006/picture">
+                        <pic:nvPicPr>
+                          <pic:cNvPr id="0" name="Picture 17"/>
+                          <pic:cNvPicPr>
+                            <a:picLocks noChangeAspect="1" noChangeArrowheads="1"/>
+                          </pic:cNvPicPr>
+                        </pic:nvPicPr>
+                        <pic:blipFill>
+                          <a:blip r:embed="rId16" cstate="print">
+                            <a:extLst>
+                              <a:ext uri="{28A0092B-C50C-407E-A947-70E740481C1C}">
+                                <a14:useLocalDpi xmlns:a14="http://schemas.microsoft.com/office/drawing/2010/main" val="0"/>
+                              </a:ext>
+                            </a:extLst>
+                          </a:blip>
+                          <a:srcRect/>
+                          <a:stretch>
+                            <a:fillRect/>
+                          </a:stretch>
+                        </pic:blipFill>
+                        <pic:spPr bwMode="auto">
+                          <a:xfrm>
+                            <a:off x="0" y="0"/>
+                            <a:ext cx="5943600" cy="3343275"/>
+                          </a:xfrm>
+                          <a:prstGeom prst="rect">
+                            <a:avLst/>
+                          </a:prstGeom>
+                          <a:noFill/>
+                          <a:ln>
+                            <a:noFill/>
+                          </a:ln>
+                        </pic:spPr>
+                      </pic:pic>
+                    </a:graphicData>
+                  </a:graphic>
+                </wp:inline>
+              </w:drawing>
+            </w:r>
+          </w:p>
+        </w:tc>
+      </w:tr>
+    </w:tbl>
+    <w:p>
+      <w:pPr>
+        <w:spacing w:before="80" w:after="80"/>
+      </w:pPr>
+      <w:r>
+        <w:lastRenderedPageBreak/>
+        <w:t xml:space="preserve"> </w:t>
+      </w:r>
+    </w:p>
+    <w:tbl>
+      <w:tblPr>
+        <w:tblW w:w="9360" w:type="dxa"/>
+        <w:tblBorders>
+          <w:top w:val="single" w:sz="4" w:space="0" w:color="auto"/>
+          <w:left w:val="single" w:sz="4" w:space="0" w:color="auto"/>
+          <w:bottom w:val="single" w:sz="4" w:space="0" w:color="auto"/>
+          <w:right w:val="single" w:sz="4" w:space="0" w:color="auto"/>
+          <w:insideH w:val="single" w:sz="4" w:space="0" w:color="auto"/>
+          <w:insideV w:val="single" w:sz="4" w:space="0" w:color="auto"/>
+        </w:tblBorders>
+        <w:tblCellMar>
+          <w:left w:w="10" w:type="dxa"/>
+          <w:right w:w="10" w:type="dxa"/>
+        </w:tblCellMar>
+        <w:tblLook w:val="04A0" w:firstRow="1" w:lastRow="0" w:firstColumn="1" w:lastColumn="0" w:noHBand="0" w:noVBand="1"/>
+      </w:tblPr>
+      <w:tblGrid>
+        <w:gridCol w:w="9760"/>
+      </w:tblGrid>
+      <w:tr>
+        <w:tc>
+          <w:tcPr>
+            <w:tcW w:w="0" w:type="auto"/>
+            <w:tcBorders>
+              <w:top w:val="dashed" w:sz="2" w:space="0" w:color="000000"/>
+              <w:left w:val="dashed" w:sz="2" w:space="0" w:color="000000"/>
+              <w:bottom w:val="dashed" w:sz="2" w:space="0" w:color="000000"/>
+              <w:right w:val="dashed" w:sz="2" w:space="0" w:color="000000"/>
+            </w:tcBorders>
+            <w:tcMar>
+              <w:top w:w="300" w:type="dxa"/>
+              <w:left w:w="200" w:type="dxa"/>
+              <w:bottom w:w="300" w:type="dxa"/>
+              <w:right w:w="200" w:type="dxa"/>
+            </w:tcMar>
+          </w:tcPr>
+          <w:p>
+            <w:pPr>
+              <w:jc w:val="center"/>
+            </w:pPr>
+            <w:r>
+              <w:rPr>
+                <w:b/>
+                <w:bCs/>
+                <w:sz w:val="20"/>
+                <w:szCs w:val="20"/>
+              </w:rPr>
+              <w:t>Screenshot: Splash Screen displayed on real Android phone</w:t>
+            </w:r>
+          </w:p>
+          <w:p>
+            <w:pPr>
+              <w:jc w:val="center"/>
+            </w:pPr>
+            <w:r>
+              <w:rPr>
+                <w:noProof/>
+              </w:rPr>
+              <w:drawing>
+                <wp:inline distT="0" distB="0" distL="0" distR="0" wp14:anchorId="461FFB81" wp14:editId="44A185E7">
+                  <wp:extent cx="5943600" cy="3343275"/>
+                  <wp:effectExtent l="0" t="0" r="0" b="9525"/>
+                  <wp:docPr id="53298886" name="Picture 13"/>
+                  <wp:cNvGraphicFramePr>
+                    <a:graphicFrameLocks xmlns:a="http://schemas.openxmlformats.org/drawingml/2006/main" noChangeAspect="1"/>
+                  </wp:cNvGraphicFramePr>
+                  <a:graphic xmlns:a="http://schemas.openxmlformats.org/drawingml/2006/main">
+                    <a:graphicData uri="http://schemas.openxmlformats.org/drawingml/2006/picture">
+                      <pic:pic xmlns:pic="http://schemas.openxmlformats.org/drawingml/2006/picture">
+                        <pic:nvPicPr>
+                          <pic:cNvPr id="0" name="Picture 34"/>
+                          <pic:cNvPicPr>
+                            <a:picLocks noChangeAspect="1" noChangeArrowheads="1"/>
+                          </pic:cNvPicPr>
+                        </pic:nvPicPr>
+                        <pic:blipFill>
+                          <a:blip r:embed="rId17" cstate="print">
+                            <a:extLst>
+                              <a:ext uri="{28A0092B-C50C-407E-A947-70E740481C1C}">
+                                <a14:useLocalDpi xmlns:a14="http://schemas.microsoft.com/office/drawing/2010/main" val="0"/>
+                              </a:ext>
+                            </a:extLst>
+                          </a:blip>
+                          <a:srcRect/>
+                          <a:stretch>
+                            <a:fillRect/>
+                          </a:stretch>
+                        </pic:blipFill>
+                        <pic:spPr bwMode="auto">
+                          <a:xfrm>
+                            <a:off x="0" y="0"/>
+                            <a:ext cx="5943600" cy="3343275"/>
+                          </a:xfrm>
+                          <a:prstGeom prst="rect">
+                            <a:avLst/>
+                          </a:prstGeom>
+                          <a:noFill/>
+                          <a:ln>
+                            <a:noFill/>
+                          </a:ln>
+                        </pic:spPr>
+                      </pic:pic>
+                    </a:graphicData>
+                  </a:graphic>
+                </wp:inline>
+              </w:drawing>
+            </w:r>
+          </w:p>
         </w:tc>
       </w:tr>
     </w:tbl>
@@ -4199,7 +4203,7 @@
                           </pic:cNvPicPr>
                         </pic:nvPicPr>
                         <pic:blipFill>
-                          <a:blip r:embed="rId11">
+                          <a:blip r:embed="rId12">
                             <a:extLst>
                               <a:ext uri="{28A0092B-C50C-407E-A947-70E740481C1C}">
                                 <a14:useLocalDpi xmlns:a14="http://schemas.microsoft.com/office/drawing/2010/main" val="0"/>
@@ -4634,7 +4638,6 @@
             </w:tcMar>
           </w:tcPr>
           <w:p>
-            <w:proofErr w:type="spellStart"/>
             <w:r>
               <w:rPr>
                 <w:sz w:val="20"/>
@@ -4642,7 +4645,6 @@
               </w:rPr>
               <w:t>ConstraintLayout</w:t>
             </w:r>
-            <w:proofErr w:type="spellEnd"/>
           </w:p>
         </w:tc>
         <w:tc>
@@ -4804,9 +4806,233 @@
     <w:p>
       <w:pPr>
         <w:spacing w:before="60" w:after="60"/>
-      </w:pPr>
-      <w:r>
-        <w:t>(Not more than 50 words)</w:t>
+        <w:rPr>
+          <w:sz w:val="24"/>
+          <w:szCs w:val="24"/>
+        </w:rPr>
+      </w:pPr>
+      <w:r>
+        <w:rPr>
+          <w:rFonts w:ascii="Arial" w:eastAsia="Arial" w:hAnsi="Arial" w:cs="Arial"/>
+          <w:color w:val="222222"/>
+        </w:rPr>
+        <w:t>Designing all screens in Figma before coding saved significant time. I learned how Material Design 3 improves user experience. Converting Figma designs to Android XML was initially challenging but the Layout Editor preview helped greatly. The Splash Screen transition works perfectly.</w:t>
+      </w:r>
+    </w:p>
+    <w:p>
+      <w:pPr>
+        <w:spacing w:before="80" w:after="80"/>
+      </w:pPr>
+      <w:r>
+        <w:t xml:space="preserve"> </w:t>
+      </w:r>
+    </w:p>
+    <w:p>
+      <w:r>
+        <w:br w:type="page"/>
+      </w:r>
+    </w:p>
+    <w:p>
+      <w:pPr>
+        <w:spacing w:before="320" w:after="160"/>
+      </w:pPr>
+      <w:r>
+        <w:rPr>
+          <w:b/>
+          <w:bCs/>
+          <w:sz w:val="26"/>
+          <w:szCs w:val="26"/>
+        </w:rPr>
+        <w:lastRenderedPageBreak/>
+        <w:t>WEEK 4: Event Handling and User Interaction</w:t>
+      </w:r>
+    </w:p>
+    <w:p>
+      <w:pPr>
+        <w:spacing w:before="80" w:after="80"/>
+      </w:pPr>
+      <w:r>
+        <w:t xml:space="preserve"> </w:t>
+      </w:r>
+    </w:p>
+    <w:p>
+      <w:pPr>
+        <w:spacing w:before="200" w:after="100"/>
+      </w:pPr>
+      <w:r>
+        <w:rPr>
+          <w:b/>
+          <w:bCs/>
+          <w:sz w:val="24"/>
+          <w:szCs w:val="24"/>
+        </w:rPr>
+        <w:t>Practical Activities Undertaken</w:t>
+      </w:r>
+    </w:p>
+    <w:p>
+      <w:pPr>
+        <w:pStyle w:val="ListParagraph"/>
+        <w:numPr>
+          <w:ilvl w:val="0"/>
+          <w:numId w:val="2"/>
+        </w:numPr>
+        <w:spacing w:before="40" w:after="40"/>
+      </w:pPr>
+      <w:r>
+        <w:t xml:space="preserve">Implemented </w:t>
+      </w:r>
+      <w:proofErr w:type="spellStart"/>
+      <w:r>
+        <w:t>LoginActivity.kt</w:t>
+      </w:r>
+      <w:proofErr w:type="spellEnd"/>
+      <w:r>
+        <w:t xml:space="preserve"> with full form validation: empty fields check and email format check.</w:t>
+      </w:r>
+    </w:p>
+    <w:p>
+      <w:pPr>
+        <w:pStyle w:val="ListParagraph"/>
+        <w:numPr>
+          <w:ilvl w:val="0"/>
+          <w:numId w:val="2"/>
+        </w:numPr>
+        <w:spacing w:before="40" w:after="40"/>
+      </w:pPr>
+      <w:r>
+        <w:t xml:space="preserve">Created </w:t>
+      </w:r>
+      <w:proofErr w:type="spellStart"/>
+      <w:r>
+        <w:t>RegistrationActivity.kt</w:t>
+      </w:r>
+      <w:proofErr w:type="spellEnd"/>
+      <w:r>
+        <w:t xml:space="preserve"> with input fields: name, email, phone, password, confirm password.</w:t>
+      </w:r>
+    </w:p>
+    <w:p>
+      <w:pPr>
+        <w:pStyle w:val="ListParagraph"/>
+        <w:numPr>
+          <w:ilvl w:val="0"/>
+          <w:numId w:val="2"/>
+        </w:numPr>
+        <w:spacing w:before="40" w:after="40"/>
+      </w:pPr>
+      <w:r>
+        <w:t xml:space="preserve">Added password visibility toggle using </w:t>
+      </w:r>
+      <w:proofErr w:type="spellStart"/>
+      <w:r>
+        <w:t>TextInputLayout</w:t>
+      </w:r>
+      <w:proofErr w:type="spellEnd"/>
+      <w:r>
+        <w:t xml:space="preserve"> from Material Design.</w:t>
+      </w:r>
+    </w:p>
+    <w:p>
+      <w:pPr>
+        <w:pStyle w:val="ListParagraph"/>
+        <w:numPr>
+          <w:ilvl w:val="0"/>
+          <w:numId w:val="2"/>
+        </w:numPr>
+        <w:spacing w:before="40" w:after="40"/>
+      </w:pPr>
+      <w:r>
+        <w:t>Implemented click listeners for: Login button, Register link, and Back navigation.</w:t>
+      </w:r>
+    </w:p>
+    <w:p>
+      <w:pPr>
+        <w:pStyle w:val="ListParagraph"/>
+        <w:numPr>
+          <w:ilvl w:val="0"/>
+          <w:numId w:val="2"/>
+        </w:numPr>
+        <w:spacing w:before="40" w:after="40"/>
+      </w:pPr>
+      <w:r>
+        <w:t>Added Toast messages to display validation error feedback to the user.</w:t>
+      </w:r>
+    </w:p>
+    <w:p>
+      <w:pPr>
+        <w:pStyle w:val="ListParagraph"/>
+        <w:numPr>
+          <w:ilvl w:val="0"/>
+          <w:numId w:val="2"/>
+        </w:numPr>
+        <w:spacing w:before="40" w:after="40"/>
+      </w:pPr>
+      <w:r>
+        <w:t>Implemented Intent navigation: Login to Home, Login to Register.</w:t>
+      </w:r>
+    </w:p>
+    <w:p>
+      <w:pPr>
+        <w:pStyle w:val="ListParagraph"/>
+        <w:numPr>
+          <w:ilvl w:val="0"/>
+          <w:numId w:val="2"/>
+        </w:numPr>
+        <w:spacing w:before="40" w:after="40"/>
+      </w:pPr>
+      <w:r>
+        <w:t>Tested all button interactions and form validation on real Android phone via USB.</w:t>
+      </w:r>
+    </w:p>
+    <w:p>
+      <w:pPr>
+        <w:pStyle w:val="ListParagraph"/>
+        <w:numPr>
+          <w:ilvl w:val="0"/>
+          <w:numId w:val="2"/>
+        </w:numPr>
+        <w:spacing w:before="40" w:after="40"/>
+      </w:pPr>
+      <w:r>
+        <w:t>Committed changes to GitHub: "feat: Login and Registration screens with validation".</w:t>
+      </w:r>
+    </w:p>
+    <w:p>
+      <w:pPr>
+        <w:spacing w:before="80" w:after="80"/>
+      </w:pPr>
+      <w:r>
+        <w:t xml:space="preserve"> </w:t>
+      </w:r>
+    </w:p>
+    <w:p>
+      <w:pPr>
+        <w:spacing w:before="200" w:after="100"/>
+      </w:pPr>
+      <w:r>
+        <w:rPr>
+          <w:b/>
+          <w:bCs/>
+          <w:sz w:val="24"/>
+          <w:szCs w:val="24"/>
+        </w:rPr>
+        <w:t>Screenshots / Evidence</w:t>
+      </w:r>
+    </w:p>
+    <w:p>
+      <w:pPr>
+        <w:spacing w:before="60" w:after="60"/>
+      </w:pPr>
+      <w:r>
+        <w:t xml:space="preserve">Screenshots Attached: Yes / </w:t>
+      </w:r>
+      <w:proofErr w:type="gramStart"/>
+      <w:r>
+        <w:t>No  (</w:t>
+      </w:r>
+      <w:proofErr w:type="gramEnd"/>
+      <w:r>
+        <w:t>circle one)</w:t>
       </w:r>
     </w:p>
     <w:p>
@@ -4842,263 +5068,6 @@
           <w:tcPr>
             <w:tcW w:w="0" w:type="auto"/>
             <w:tcBorders>
-              <w:top w:val="single" w:sz="1" w:space="0" w:color="000000"/>
-              <w:left w:val="single" w:sz="1" w:space="0" w:color="000000"/>
-              <w:bottom w:val="single" w:sz="1" w:space="0" w:color="000000"/>
-              <w:right w:val="single" w:sz="1" w:space="0" w:color="000000"/>
-            </w:tcBorders>
-            <w:tcMar>
-              <w:top w:w="120" w:type="dxa"/>
-              <w:left w:w="160" w:type="dxa"/>
-              <w:bottom w:w="600" w:type="dxa"/>
-              <w:right w:w="160" w:type="dxa"/>
-            </w:tcMar>
-          </w:tcPr>
-          <w:p/>
-        </w:tc>
-      </w:tr>
-    </w:tbl>
-    <w:p>
-      <w:r>
-        <w:br w:type="page"/>
-      </w:r>
-    </w:p>
-    <w:p>
-      <w:pPr>
-        <w:spacing w:before="320" w:after="160"/>
-      </w:pPr>
-      <w:r>
-        <w:rPr>
-          <w:b/>
-          <w:bCs/>
-          <w:sz w:val="26"/>
-          <w:szCs w:val="26"/>
-        </w:rPr>
-        <w:lastRenderedPageBreak/>
-        <w:t>WEEK 4: Event Handling and User Interaction</w:t>
-      </w:r>
-    </w:p>
-    <w:p>
-      <w:pPr>
-        <w:spacing w:before="80" w:after="80"/>
-      </w:pPr>
-      <w:r>
-        <w:t xml:space="preserve"> </w:t>
-      </w:r>
-    </w:p>
-    <w:p>
-      <w:pPr>
-        <w:spacing w:before="200" w:after="100"/>
-      </w:pPr>
-      <w:r>
-        <w:rPr>
-          <w:b/>
-          <w:bCs/>
-          <w:sz w:val="24"/>
-          <w:szCs w:val="24"/>
-        </w:rPr>
-        <w:t>Practical Activities Undertaken</w:t>
-      </w:r>
-    </w:p>
-    <w:p>
-      <w:pPr>
-        <w:pStyle w:val="ListParagraph"/>
-        <w:numPr>
-          <w:ilvl w:val="0"/>
-          <w:numId w:val="2"/>
-        </w:numPr>
-        <w:spacing w:before="40" w:after="40"/>
-      </w:pPr>
-      <w:r>
-        <w:t xml:space="preserve">Implemented </w:t>
-      </w:r>
-      <w:proofErr w:type="spellStart"/>
-      <w:r>
-        <w:t>LoginActivity.kt</w:t>
-      </w:r>
-      <w:proofErr w:type="spellEnd"/>
-      <w:r>
-        <w:t xml:space="preserve"> with full form validation: empty fields check and email format check.</w:t>
-      </w:r>
-    </w:p>
-    <w:p>
-      <w:pPr>
-        <w:pStyle w:val="ListParagraph"/>
-        <w:numPr>
-          <w:ilvl w:val="0"/>
-          <w:numId w:val="2"/>
-        </w:numPr>
-        <w:spacing w:before="40" w:after="40"/>
-      </w:pPr>
-      <w:r>
-        <w:t xml:space="preserve">Created </w:t>
-      </w:r>
-      <w:proofErr w:type="spellStart"/>
-      <w:r>
-        <w:t>RegistrationActivity.kt</w:t>
-      </w:r>
-      <w:proofErr w:type="spellEnd"/>
-      <w:r>
-        <w:t xml:space="preserve"> with input fields: name, email, phone, password, confirm password.</w:t>
-      </w:r>
-    </w:p>
-    <w:p>
-      <w:pPr>
-        <w:pStyle w:val="ListParagraph"/>
-        <w:numPr>
-          <w:ilvl w:val="0"/>
-          <w:numId w:val="2"/>
-        </w:numPr>
-        <w:spacing w:before="40" w:after="40"/>
-      </w:pPr>
-      <w:r>
-        <w:t xml:space="preserve">Added password visibility toggle using </w:t>
-      </w:r>
-      <w:proofErr w:type="spellStart"/>
-      <w:r>
-        <w:t>TextInputLayout</w:t>
-      </w:r>
-      <w:proofErr w:type="spellEnd"/>
-      <w:r>
-        <w:t xml:space="preserve"> from Material Design.</w:t>
-      </w:r>
-    </w:p>
-    <w:p>
-      <w:pPr>
-        <w:pStyle w:val="ListParagraph"/>
-        <w:numPr>
-          <w:ilvl w:val="0"/>
-          <w:numId w:val="2"/>
-        </w:numPr>
-        <w:spacing w:before="40" w:after="40"/>
-      </w:pPr>
-      <w:r>
-        <w:t>Implemented click listeners for: Login button, Register link, and Back navigation.</w:t>
-      </w:r>
-    </w:p>
-    <w:p>
-      <w:pPr>
-        <w:pStyle w:val="ListParagraph"/>
-        <w:numPr>
-          <w:ilvl w:val="0"/>
-          <w:numId w:val="2"/>
-        </w:numPr>
-        <w:spacing w:before="40" w:after="40"/>
-      </w:pPr>
-      <w:r>
-        <w:t>Added Toast messages to display validation error feedback to the user.</w:t>
-      </w:r>
-    </w:p>
-    <w:p>
-      <w:pPr>
-        <w:pStyle w:val="ListParagraph"/>
-        <w:numPr>
-          <w:ilvl w:val="0"/>
-          <w:numId w:val="2"/>
-        </w:numPr>
-        <w:spacing w:before="40" w:after="40"/>
-      </w:pPr>
-      <w:r>
-        <w:t>Implemented Intent navigation: Login to Home, Login to Register.</w:t>
-      </w:r>
-    </w:p>
-    <w:p>
-      <w:pPr>
-        <w:pStyle w:val="ListParagraph"/>
-        <w:numPr>
-          <w:ilvl w:val="0"/>
-          <w:numId w:val="2"/>
-        </w:numPr>
-        <w:spacing w:before="40" w:after="40"/>
-      </w:pPr>
-      <w:r>
-        <w:t>Tested all button interactions and form validation on real Android phone via USB.</w:t>
-      </w:r>
-    </w:p>
-    <w:p>
-      <w:pPr>
-        <w:pStyle w:val="ListParagraph"/>
-        <w:numPr>
-          <w:ilvl w:val="0"/>
-          <w:numId w:val="2"/>
-        </w:numPr>
-        <w:spacing w:before="40" w:after="40"/>
-      </w:pPr>
-      <w:r>
-        <w:t>Committed changes to GitHub: "feat: Login and Registration screens with validation".</w:t>
-      </w:r>
-    </w:p>
-    <w:p>
-      <w:pPr>
-        <w:spacing w:before="80" w:after="80"/>
-      </w:pPr>
-      <w:r>
-        <w:t xml:space="preserve"> </w:t>
-      </w:r>
-    </w:p>
-    <w:p>
-      <w:pPr>
-        <w:spacing w:before="200" w:after="100"/>
-      </w:pPr>
-      <w:r>
-        <w:rPr>
-          <w:b/>
-          <w:bCs/>
-          <w:sz w:val="24"/>
-          <w:szCs w:val="24"/>
-        </w:rPr>
-        <w:t>Screenshots / Evidence</w:t>
-      </w:r>
-    </w:p>
-    <w:p>
-      <w:pPr>
-        <w:spacing w:before="60" w:after="60"/>
-      </w:pPr>
-      <w:r>
-        <w:t xml:space="preserve">Screenshots Attached: Yes / </w:t>
-      </w:r>
-      <w:proofErr w:type="gramStart"/>
-      <w:r>
-        <w:t>No  (</w:t>
-      </w:r>
-      <w:proofErr w:type="gramEnd"/>
-      <w:r>
-        <w:t>circle one)</w:t>
-      </w:r>
-    </w:p>
-    <w:p>
-      <w:pPr>
-        <w:spacing w:before="80" w:after="80"/>
-      </w:pPr>
-      <w:r>
-        <w:t xml:space="preserve"> </w:t>
-      </w:r>
-    </w:p>
-    <w:tbl>
-      <w:tblPr>
-        <w:tblW w:w="9360" w:type="dxa"/>
-        <w:tblBorders>
-          <w:top w:val="single" w:sz="4" w:space="0" w:color="auto"/>
-          <w:left w:val="single" w:sz="4" w:space="0" w:color="auto"/>
-          <w:bottom w:val="single" w:sz="4" w:space="0" w:color="auto"/>
-          <w:right w:val="single" w:sz="4" w:space="0" w:color="auto"/>
-          <w:insideH w:val="single" w:sz="4" w:space="0" w:color="auto"/>
-          <w:insideV w:val="single" w:sz="4" w:space="0" w:color="auto"/>
-        </w:tblBorders>
-        <w:tblCellMar>
-          <w:left w:w="10" w:type="dxa"/>
-          <w:right w:w="10" w:type="dxa"/>
-        </w:tblCellMar>
-        <w:tblLook w:val="04A0" w:firstRow="1" w:lastRow="0" w:firstColumn="1" w:lastColumn="0" w:noHBand="0" w:noVBand="1"/>
-      </w:tblPr>
-      <w:tblGrid>
-        <w:gridCol w:w="9360"/>
-      </w:tblGrid>
-      <w:tr>
-        <w:tc>
-          <w:tcPr>
-            <w:tcW w:w="0" w:type="auto"/>
-            <w:tcBorders>
               <w:top w:val="dashed" w:sz="2" w:space="0" w:color="000000"/>
               <w:left w:val="dashed" w:sz="2" w:space="0" w:color="000000"/>
               <w:bottom w:val="dashed" w:sz="2" w:space="0" w:color="000000"/>
@@ -5167,268 +5136,6 @@
                       <pic:pic xmlns:pic="http://schemas.openxmlformats.org/drawingml/2006/picture">
                         <pic:nvPicPr>
                           <pic:cNvPr id="0" name="Picture 38"/>
-                          <pic:cNvPicPr>
-                            <a:picLocks noChangeAspect="1" noChangeArrowheads="1"/>
-                          </pic:cNvPicPr>
-                        </pic:nvPicPr>
-                        <pic:blipFill>
-                          <a:blip r:embed="rId16">
-                            <a:extLst>
-                              <a:ext uri="{28A0092B-C50C-407E-A947-70E740481C1C}">
-                                <a14:useLocalDpi xmlns:a14="http://schemas.microsoft.com/office/drawing/2010/main" val="0"/>
-                              </a:ext>
-                            </a:extLst>
-                          </a:blip>
-                          <a:srcRect/>
-                          <a:stretch>
-                            <a:fillRect/>
-                          </a:stretch>
-                        </pic:blipFill>
-                        <pic:spPr bwMode="auto">
-                          <a:xfrm>
-                            <a:off x="0" y="0"/>
-                            <a:ext cx="3676650" cy="8229600"/>
-                          </a:xfrm>
-                          <a:prstGeom prst="rect">
-                            <a:avLst/>
-                          </a:prstGeom>
-                          <a:noFill/>
-                          <a:ln>
-                            <a:noFill/>
-                          </a:ln>
-                        </pic:spPr>
-                      </pic:pic>
-                    </a:graphicData>
-                  </a:graphic>
-                </wp:inline>
-              </w:drawing>
-            </w:r>
-          </w:p>
-        </w:tc>
-      </w:tr>
-    </w:tbl>
-    <w:p>
-      <w:pPr>
-        <w:spacing w:before="80" w:after="80"/>
-      </w:pPr>
-      <w:r>
-        <w:lastRenderedPageBreak/>
-        <w:t xml:space="preserve"> </w:t>
-      </w:r>
-    </w:p>
-    <w:tbl>
-      <w:tblPr>
-        <w:tblW w:w="9360" w:type="dxa"/>
-        <w:tblBorders>
-          <w:top w:val="single" w:sz="4" w:space="0" w:color="auto"/>
-          <w:left w:val="single" w:sz="4" w:space="0" w:color="auto"/>
-          <w:bottom w:val="single" w:sz="4" w:space="0" w:color="auto"/>
-          <w:right w:val="single" w:sz="4" w:space="0" w:color="auto"/>
-          <w:insideH w:val="single" w:sz="4" w:space="0" w:color="auto"/>
-          <w:insideV w:val="single" w:sz="4" w:space="0" w:color="auto"/>
-        </w:tblBorders>
-        <w:tblCellMar>
-          <w:left w:w="10" w:type="dxa"/>
-          <w:right w:w="10" w:type="dxa"/>
-        </w:tblCellMar>
-        <w:tblLook w:val="04A0" w:firstRow="1" w:lastRow="0" w:firstColumn="1" w:lastColumn="0" w:noHBand="0" w:noVBand="1"/>
-      </w:tblPr>
-      <w:tblGrid>
-        <w:gridCol w:w="9760"/>
-      </w:tblGrid>
-      <w:tr>
-        <w:tc>
-          <w:tcPr>
-            <w:tcW w:w="0" w:type="auto"/>
-            <w:tcBorders>
-              <w:top w:val="dashed" w:sz="2" w:space="0" w:color="000000"/>
-              <w:left w:val="dashed" w:sz="2" w:space="0" w:color="000000"/>
-              <w:bottom w:val="dashed" w:sz="2" w:space="0" w:color="000000"/>
-              <w:right w:val="dashed" w:sz="2" w:space="0" w:color="000000"/>
-            </w:tcBorders>
-            <w:tcMar>
-              <w:top w:w="300" w:type="dxa"/>
-              <w:left w:w="200" w:type="dxa"/>
-              <w:bottom w:w="300" w:type="dxa"/>
-              <w:right w:w="200" w:type="dxa"/>
-            </w:tcMar>
-          </w:tcPr>
-          <w:p>
-            <w:pPr>
-              <w:jc w:val="center"/>
-            </w:pPr>
-            <w:r>
-              <w:rPr>
-                <w:b/>
-                <w:bCs/>
-                <w:sz w:val="20"/>
-                <w:szCs w:val="20"/>
-              </w:rPr>
-              <w:t xml:space="preserve">Screenshot: </w:t>
-            </w:r>
-            <w:proofErr w:type="spellStart"/>
-            <w:r>
-              <w:rPr>
-                <w:b/>
-                <w:bCs/>
-                <w:sz w:val="20"/>
-                <w:szCs w:val="20"/>
-              </w:rPr>
-              <w:t>RegistrationActivity.kt</w:t>
-            </w:r>
-            <w:proofErr w:type="spellEnd"/>
-            <w:r>
-              <w:rPr>
-                <w:b/>
-                <w:bCs/>
-                <w:sz w:val="20"/>
-                <w:szCs w:val="20"/>
-              </w:rPr>
-              <w:t xml:space="preserve"> code open in Android Studio</w:t>
-            </w:r>
-          </w:p>
-          <w:p>
-            <w:pPr>
-              <w:jc w:val="center"/>
-            </w:pPr>
-            <w:r>
-              <w:rPr>
-                <w:noProof/>
-              </w:rPr>
-              <w:drawing>
-                <wp:inline distT="0" distB="0" distL="0" distR="0" wp14:anchorId="646E9F12" wp14:editId="3B57A75E">
-                  <wp:extent cx="5943600" cy="3157855"/>
-                  <wp:effectExtent l="0" t="0" r="0" b="4445"/>
-                  <wp:docPr id="687395050" name="Picture 16"/>
-                  <wp:cNvGraphicFramePr>
-                    <a:graphicFrameLocks xmlns:a="http://schemas.openxmlformats.org/drawingml/2006/main" noChangeAspect="1"/>
-                  </wp:cNvGraphicFramePr>
-                  <a:graphic xmlns:a="http://schemas.openxmlformats.org/drawingml/2006/main">
-                    <a:graphicData uri="http://schemas.openxmlformats.org/drawingml/2006/picture">
-                      <pic:pic xmlns:pic="http://schemas.openxmlformats.org/drawingml/2006/picture">
-                        <pic:nvPicPr>
-                          <pic:cNvPr id="0" name="Picture 40"/>
-                          <pic:cNvPicPr>
-                            <a:picLocks noChangeAspect="1" noChangeArrowheads="1"/>
-                          </pic:cNvPicPr>
-                        </pic:nvPicPr>
-                        <pic:blipFill>
-                          <a:blip r:embed="rId17" cstate="print">
-                            <a:extLst>
-                              <a:ext uri="{28A0092B-C50C-407E-A947-70E740481C1C}">
-                                <a14:useLocalDpi xmlns:a14="http://schemas.microsoft.com/office/drawing/2010/main" val="0"/>
-                              </a:ext>
-                            </a:extLst>
-                          </a:blip>
-                          <a:srcRect/>
-                          <a:stretch>
-                            <a:fillRect/>
-                          </a:stretch>
-                        </pic:blipFill>
-                        <pic:spPr bwMode="auto">
-                          <a:xfrm>
-                            <a:off x="0" y="0"/>
-                            <a:ext cx="5943600" cy="3157855"/>
-                          </a:xfrm>
-                          <a:prstGeom prst="rect">
-                            <a:avLst/>
-                          </a:prstGeom>
-                          <a:noFill/>
-                          <a:ln>
-                            <a:noFill/>
-                          </a:ln>
-                        </pic:spPr>
-                      </pic:pic>
-                    </a:graphicData>
-                  </a:graphic>
-                </wp:inline>
-              </w:drawing>
-            </w:r>
-          </w:p>
-        </w:tc>
-      </w:tr>
-    </w:tbl>
-    <w:p>
-      <w:pPr>
-        <w:spacing w:before="80" w:after="80"/>
-      </w:pPr>
-      <w:r>
-        <w:t xml:space="preserve"> </w:t>
-      </w:r>
-    </w:p>
-    <w:tbl>
-      <w:tblPr>
-        <w:tblW w:w="9360" w:type="dxa"/>
-        <w:tblBorders>
-          <w:top w:val="single" w:sz="4" w:space="0" w:color="auto"/>
-          <w:left w:val="single" w:sz="4" w:space="0" w:color="auto"/>
-          <w:bottom w:val="single" w:sz="4" w:space="0" w:color="auto"/>
-          <w:right w:val="single" w:sz="4" w:space="0" w:color="auto"/>
-          <w:insideH w:val="single" w:sz="4" w:space="0" w:color="auto"/>
-          <w:insideV w:val="single" w:sz="4" w:space="0" w:color="auto"/>
-        </w:tblBorders>
-        <w:tblCellMar>
-          <w:left w:w="10" w:type="dxa"/>
-          <w:right w:w="10" w:type="dxa"/>
-        </w:tblCellMar>
-        <w:tblLook w:val="04A0" w:firstRow="1" w:lastRow="0" w:firstColumn="1" w:lastColumn="0" w:noHBand="0" w:noVBand="1"/>
-      </w:tblPr>
-      <w:tblGrid>
-        <w:gridCol w:w="9360"/>
-      </w:tblGrid>
-      <w:tr>
-        <w:tc>
-          <w:tcPr>
-            <w:tcW w:w="0" w:type="auto"/>
-            <w:tcBorders>
-              <w:top w:val="dashed" w:sz="2" w:space="0" w:color="000000"/>
-              <w:left w:val="dashed" w:sz="2" w:space="0" w:color="000000"/>
-              <w:bottom w:val="dashed" w:sz="2" w:space="0" w:color="000000"/>
-              <w:right w:val="dashed" w:sz="2" w:space="0" w:color="000000"/>
-            </w:tcBorders>
-            <w:tcMar>
-              <w:top w:w="300" w:type="dxa"/>
-              <w:left w:w="200" w:type="dxa"/>
-              <w:bottom w:w="300" w:type="dxa"/>
-              <w:right w:w="200" w:type="dxa"/>
-            </w:tcMar>
-          </w:tcPr>
-          <w:p>
-            <w:pPr>
-              <w:jc w:val="center"/>
-            </w:pPr>
-            <w:r>
-              <w:rPr>
-                <w:b/>
-                <w:bCs/>
-                <w:sz w:val="20"/>
-                <w:szCs w:val="20"/>
-              </w:rPr>
-              <w:t>Screenshot: Login Screen on real phone showing validation toast for empty fields</w:t>
-            </w:r>
-          </w:p>
-          <w:p>
-            <w:pPr>
-              <w:jc w:val="center"/>
-            </w:pPr>
-            <w:r>
-              <w:rPr>
-                <w:noProof/>
-              </w:rPr>
-              <w:lastRenderedPageBreak/>
-              <w:drawing>
-                <wp:inline distT="0" distB="0" distL="0" distR="0" wp14:anchorId="5049FA42" wp14:editId="3DB9B6EB">
-                  <wp:extent cx="3676650" cy="8229600"/>
-                  <wp:effectExtent l="0" t="0" r="0" b="0"/>
-                  <wp:docPr id="901428080" name="Picture 17"/>
-                  <wp:cNvGraphicFramePr>
-                    <a:graphicFrameLocks xmlns:a="http://schemas.openxmlformats.org/drawingml/2006/main" noChangeAspect="1"/>
-                  </wp:cNvGraphicFramePr>
-                  <a:graphic xmlns:a="http://schemas.openxmlformats.org/drawingml/2006/main">
-                    <a:graphicData uri="http://schemas.openxmlformats.org/drawingml/2006/picture">
-                      <pic:pic xmlns:pic="http://schemas.openxmlformats.org/drawingml/2006/picture">
-                        <pic:nvPicPr>
-                          <pic:cNvPr id="0" name="Picture 42"/>
                           <pic:cNvPicPr>
                             <a:picLocks noChangeAspect="1" noChangeArrowheads="1"/>
                           </pic:cNvPicPr>
@@ -5496,7 +5203,7 @@
         <w:tblLook w:val="04A0" w:firstRow="1" w:lastRow="0" w:firstColumn="1" w:lastColumn="0" w:noHBand="0" w:noVBand="1"/>
       </w:tblPr>
       <w:tblGrid>
-        <w:gridCol w:w="9360"/>
+        <w:gridCol w:w="9760"/>
       </w:tblGrid>
       <w:tr>
         <w:tc>
@@ -5526,7 +5233,27 @@
                 <w:sz w:val="20"/>
                 <w:szCs w:val="20"/>
               </w:rPr>
-              <w:t>Screenshot: Registration Screen displayed on real Android phone</w:t>
+              <w:t xml:space="preserve">Screenshot: </w:t>
+            </w:r>
+            <w:proofErr w:type="spellStart"/>
+            <w:r>
+              <w:rPr>
+                <w:b/>
+                <w:bCs/>
+                <w:sz w:val="20"/>
+                <w:szCs w:val="20"/>
+              </w:rPr>
+              <w:t>RegistrationActivity.kt</w:t>
+            </w:r>
+            <w:proofErr w:type="spellEnd"/>
+            <w:r>
+              <w:rPr>
+                <w:b/>
+                <w:bCs/>
+                <w:sz w:val="20"/>
+                <w:szCs w:val="20"/>
+              </w:rPr>
+              <w:t xml:space="preserve"> code open in Android Studio</w:t>
             </w:r>
           </w:p>
           <w:p>
@@ -5535,12 +5262,56 @@
             </w:pPr>
             <w:r>
               <w:rPr>
-                <w:i/>
-                <w:iCs/>
-                <w:sz w:val="20"/>
-                <w:szCs w:val="20"/>
-              </w:rPr>
-              <w:t>[Paste your screenshot here]</w:t>
+                <w:noProof/>
+              </w:rPr>
+              <w:drawing>
+                <wp:inline distT="0" distB="0" distL="0" distR="0" wp14:anchorId="646E9F12" wp14:editId="3B57A75E">
+                  <wp:extent cx="5943600" cy="3157855"/>
+                  <wp:effectExtent l="0" t="0" r="0" b="4445"/>
+                  <wp:docPr id="687395050" name="Picture 16"/>
+                  <wp:cNvGraphicFramePr>
+                    <a:graphicFrameLocks xmlns:a="http://schemas.openxmlformats.org/drawingml/2006/main" noChangeAspect="1"/>
+                  </wp:cNvGraphicFramePr>
+                  <a:graphic xmlns:a="http://schemas.openxmlformats.org/drawingml/2006/main">
+                    <a:graphicData uri="http://schemas.openxmlformats.org/drawingml/2006/picture">
+                      <pic:pic xmlns:pic="http://schemas.openxmlformats.org/drawingml/2006/picture">
+                        <pic:nvPicPr>
+                          <pic:cNvPr id="0" name="Picture 40"/>
+                          <pic:cNvPicPr>
+                            <a:picLocks noChangeAspect="1" noChangeArrowheads="1"/>
+                          </pic:cNvPicPr>
+                        </pic:nvPicPr>
+                        <pic:blipFill>
+                          <a:blip r:embed="rId19" cstate="print">
+                            <a:extLst>
+                              <a:ext uri="{28A0092B-C50C-407E-A947-70E740481C1C}">
+                                <a14:useLocalDpi xmlns:a14="http://schemas.microsoft.com/office/drawing/2010/main" val="0"/>
+                              </a:ext>
+                            </a:extLst>
+                          </a:blip>
+                          <a:srcRect/>
+                          <a:stretch>
+                            <a:fillRect/>
+                          </a:stretch>
+                        </pic:blipFill>
+                        <pic:spPr bwMode="auto">
+                          <a:xfrm>
+                            <a:off x="0" y="0"/>
+                            <a:ext cx="5943600" cy="3157855"/>
+                          </a:xfrm>
+                          <a:prstGeom prst="rect">
+                            <a:avLst/>
+                          </a:prstGeom>
+                          <a:noFill/>
+                          <a:ln>
+                            <a:noFill/>
+                          </a:ln>
+                        </pic:spPr>
+                      </pic:pic>
+                    </a:graphicData>
+                  </a:graphic>
+                </wp:inline>
+              </w:drawing>
             </w:r>
           </w:p>
         </w:tc>
@@ -5602,7 +5373,7 @@
                 <w:sz w:val="20"/>
                 <w:szCs w:val="20"/>
               </w:rPr>
-              <w:t>Screenshot: Successful navigation from Login to Home Screen on real phone</w:t>
+              <w:t>Screenshot: Login Screen on real phone showing validation toast for empty fields</w:t>
             </w:r>
           </w:p>
           <w:p>
@@ -5615,10 +5386,10 @@
               </w:rPr>
               <w:lastRenderedPageBreak/>
               <w:drawing>
-                <wp:inline distT="0" distB="0" distL="0" distR="0" wp14:anchorId="0CD7A52E" wp14:editId="50213A1E">
+                <wp:inline distT="0" distB="0" distL="0" distR="0" wp14:anchorId="5049FA42" wp14:editId="3DB9B6EB">
                   <wp:extent cx="3676650" cy="8229600"/>
                   <wp:effectExtent l="0" t="0" r="0" b="0"/>
-                  <wp:docPr id="841188242" name="Picture 19"/>
+                  <wp:docPr id="901428080" name="Picture 17"/>
                   <wp:cNvGraphicFramePr>
                     <a:graphicFrameLocks xmlns:a="http://schemas.openxmlformats.org/drawingml/2006/main" noChangeAspect="1"/>
                   </wp:cNvGraphicFramePr>
@@ -5626,13 +5397,13 @@
                     <a:graphicData uri="http://schemas.openxmlformats.org/drawingml/2006/picture">
                       <pic:pic xmlns:pic="http://schemas.openxmlformats.org/drawingml/2006/picture">
                         <pic:nvPicPr>
-                          <pic:cNvPr id="0" name="Picture 46"/>
+                          <pic:cNvPr id="0" name="Picture 42"/>
                           <pic:cNvPicPr>
                             <a:picLocks noChangeAspect="1" noChangeArrowheads="1"/>
                           </pic:cNvPicPr>
                         </pic:nvPicPr>
                         <pic:blipFill>
-                          <a:blip r:embed="rId19">
+                          <a:blip r:embed="rId20">
                             <a:extLst>
                               <a:ext uri="{28A0092B-C50C-407E-A947-70E740481C1C}">
                                 <a14:useLocalDpi xmlns:a14="http://schemas.microsoft.com/office/drawing/2010/main" val="0"/>
@@ -5663,6 +5434,204 @@
                 </wp:inline>
               </w:drawing>
             </w:r>
+          </w:p>
+        </w:tc>
+      </w:tr>
+    </w:tbl>
+    <w:p>
+      <w:pPr>
+        <w:spacing w:before="80" w:after="80"/>
+      </w:pPr>
+      <w:r>
+        <w:lastRenderedPageBreak/>
+        <w:t xml:space="preserve"> </w:t>
+      </w:r>
+    </w:p>
+    <w:tbl>
+      <w:tblPr>
+        <w:tblW w:w="9360" w:type="dxa"/>
+        <w:tblBorders>
+          <w:top w:val="single" w:sz="4" w:space="0" w:color="auto"/>
+          <w:left w:val="single" w:sz="4" w:space="0" w:color="auto"/>
+          <w:bottom w:val="single" w:sz="4" w:space="0" w:color="auto"/>
+          <w:right w:val="single" w:sz="4" w:space="0" w:color="auto"/>
+          <w:insideH w:val="single" w:sz="4" w:space="0" w:color="auto"/>
+          <w:insideV w:val="single" w:sz="4" w:space="0" w:color="auto"/>
+        </w:tblBorders>
+        <w:tblCellMar>
+          <w:left w:w="10" w:type="dxa"/>
+          <w:right w:w="10" w:type="dxa"/>
+        </w:tblCellMar>
+        <w:tblLook w:val="04A0" w:firstRow="1" w:lastRow="0" w:firstColumn="1" w:lastColumn="0" w:noHBand="0" w:noVBand="1"/>
+      </w:tblPr>
+      <w:tblGrid>
+        <w:gridCol w:w="9360"/>
+      </w:tblGrid>
+      <w:tr>
+        <w:tc>
+          <w:tcPr>
+            <w:tcW w:w="0" w:type="auto"/>
+            <w:tcBorders>
+              <w:top w:val="dashed" w:sz="2" w:space="0" w:color="000000"/>
+              <w:left w:val="dashed" w:sz="2" w:space="0" w:color="000000"/>
+              <w:bottom w:val="dashed" w:sz="2" w:space="0" w:color="000000"/>
+              <w:right w:val="dashed" w:sz="2" w:space="0" w:color="000000"/>
+            </w:tcBorders>
+            <w:tcMar>
+              <w:top w:w="300" w:type="dxa"/>
+              <w:left w:w="200" w:type="dxa"/>
+              <w:bottom w:w="300" w:type="dxa"/>
+              <w:right w:w="200" w:type="dxa"/>
+            </w:tcMar>
+          </w:tcPr>
+          <w:p>
+            <w:pPr>
+              <w:jc w:val="center"/>
+            </w:pPr>
+            <w:r>
+              <w:rPr>
+                <w:b/>
+                <w:bCs/>
+                <w:sz w:val="20"/>
+                <w:szCs w:val="20"/>
+              </w:rPr>
+              <w:t>Screenshot: Registration Screen displayed on real Android phone</w:t>
+            </w:r>
+          </w:p>
+          <w:p>
+            <w:pPr>
+              <w:jc w:val="center"/>
+            </w:pPr>
+            <w:r>
+              <w:rPr>
+                <w:i/>
+                <w:iCs/>
+                <w:sz w:val="20"/>
+                <w:szCs w:val="20"/>
+              </w:rPr>
+              <w:t>[Paste your screenshot here]</w:t>
+            </w:r>
+          </w:p>
+        </w:tc>
+      </w:tr>
+    </w:tbl>
+    <w:p>
+      <w:pPr>
+        <w:spacing w:before="80" w:after="80"/>
+      </w:pPr>
+      <w:r>
+        <w:t xml:space="preserve"> </w:t>
+      </w:r>
+    </w:p>
+    <w:tbl>
+      <w:tblPr>
+        <w:tblW w:w="9360" w:type="dxa"/>
+        <w:tblBorders>
+          <w:top w:val="single" w:sz="4" w:space="0" w:color="auto"/>
+          <w:left w:val="single" w:sz="4" w:space="0" w:color="auto"/>
+          <w:bottom w:val="single" w:sz="4" w:space="0" w:color="auto"/>
+          <w:right w:val="single" w:sz="4" w:space="0" w:color="auto"/>
+          <w:insideH w:val="single" w:sz="4" w:space="0" w:color="auto"/>
+          <w:insideV w:val="single" w:sz="4" w:space="0" w:color="auto"/>
+        </w:tblBorders>
+        <w:tblCellMar>
+          <w:left w:w="10" w:type="dxa"/>
+          <w:right w:w="10" w:type="dxa"/>
+        </w:tblCellMar>
+        <w:tblLook w:val="04A0" w:firstRow="1" w:lastRow="0" w:firstColumn="1" w:lastColumn="0" w:noHBand="0" w:noVBand="1"/>
+      </w:tblPr>
+      <w:tblGrid>
+        <w:gridCol w:w="9360"/>
+      </w:tblGrid>
+      <w:tr>
+        <w:tc>
+          <w:tcPr>
+            <w:tcW w:w="0" w:type="auto"/>
+            <w:tcBorders>
+              <w:top w:val="dashed" w:sz="2" w:space="0" w:color="000000"/>
+              <w:left w:val="dashed" w:sz="2" w:space="0" w:color="000000"/>
+              <w:bottom w:val="dashed" w:sz="2" w:space="0" w:color="000000"/>
+              <w:right w:val="dashed" w:sz="2" w:space="0" w:color="000000"/>
+            </w:tcBorders>
+            <w:tcMar>
+              <w:top w:w="300" w:type="dxa"/>
+              <w:left w:w="200" w:type="dxa"/>
+              <w:bottom w:w="300" w:type="dxa"/>
+              <w:right w:w="200" w:type="dxa"/>
+            </w:tcMar>
+          </w:tcPr>
+          <w:p>
+            <w:pPr>
+              <w:jc w:val="center"/>
+            </w:pPr>
+            <w:r>
+              <w:rPr>
+                <w:b/>
+                <w:bCs/>
+                <w:sz w:val="20"/>
+                <w:szCs w:val="20"/>
+              </w:rPr>
+              <w:t>Screenshot: Successful navigation from Login to Home Screen on real phone</w:t>
+            </w:r>
+          </w:p>
+          <w:p>
+            <w:pPr>
+              <w:jc w:val="center"/>
+            </w:pPr>
+            <w:r>
+              <w:rPr>
+                <w:noProof/>
+              </w:rPr>
+              <w:lastRenderedPageBreak/>
+              <w:drawing>
+                <wp:inline distT="0" distB="0" distL="0" distR="0" wp14:anchorId="0CD7A52E" wp14:editId="50213A1E">
+                  <wp:extent cx="3676650" cy="8229600"/>
+                  <wp:effectExtent l="0" t="0" r="0" b="0"/>
+                  <wp:docPr id="841188242" name="Picture 19"/>
+                  <wp:cNvGraphicFramePr>
+                    <a:graphicFrameLocks xmlns:a="http://schemas.openxmlformats.org/drawingml/2006/main" noChangeAspect="1"/>
+                  </wp:cNvGraphicFramePr>
+                  <a:graphic xmlns:a="http://schemas.openxmlformats.org/drawingml/2006/main">
+                    <a:graphicData uri="http://schemas.openxmlformats.org/drawingml/2006/picture">
+                      <pic:pic xmlns:pic="http://schemas.openxmlformats.org/drawingml/2006/picture">
+                        <pic:nvPicPr>
+                          <pic:cNvPr id="0" name="Picture 46"/>
+                          <pic:cNvPicPr>
+                            <a:picLocks noChangeAspect="1" noChangeArrowheads="1"/>
+                          </pic:cNvPicPr>
+                        </pic:nvPicPr>
+                        <pic:blipFill>
+                          <a:blip r:embed="rId21">
+                            <a:extLst>
+                              <a:ext uri="{28A0092B-C50C-407E-A947-70E740481C1C}">
+                                <a14:useLocalDpi xmlns:a14="http://schemas.microsoft.com/office/drawing/2010/main" val="0"/>
+                              </a:ext>
+                            </a:extLst>
+                          </a:blip>
+                          <a:srcRect/>
+                          <a:stretch>
+                            <a:fillRect/>
+                          </a:stretch>
+                        </pic:blipFill>
+                        <pic:spPr bwMode="auto">
+                          <a:xfrm>
+                            <a:off x="0" y="0"/>
+                            <a:ext cx="3676650" cy="8229600"/>
+                          </a:xfrm>
+                          <a:prstGeom prst="rect">
+                            <a:avLst/>
+                          </a:prstGeom>
+                          <a:noFill/>
+                          <a:ln>
+                            <a:noFill/>
+                          </a:ln>
+                        </pic:spPr>
+                      </pic:pic>
+                    </a:graphicData>
+                  </a:graphic>
+                </wp:inline>
+              </w:drawing>
+            </w:r>
             <w:r>
               <w:rPr>
                 <w:noProof/>
@@ -5686,7 +5655,7 @@
                           </pic:cNvPicPr>
                         </pic:nvPicPr>
                         <pic:blipFill>
-                          <a:blip r:embed="rId19">
+                          <a:blip r:embed="rId21">
                             <a:extLst>
                               <a:ext uri="{28A0092B-C50C-407E-A947-70E740481C1C}">
                                 <a14:useLocalDpi xmlns:a14="http://schemas.microsoft.com/office/drawing/2010/main" val="0"/>
@@ -24243,7 +24212,6 @@
   <w:style w:type="character" w:default="1" w:styleId="DefaultParagraphFont">
     <w:name w:val="Default Paragraph Font"/>
     <w:uiPriority w:val="1"/>
-    <w:semiHidden/>
     <w:unhideWhenUsed/>
   </w:style>
   <w:style w:type="table" w:default="1" w:styleId="TableNormal">

</xml_diff>